<commit_message>
F3: alinea notebooks e informe con requirements.txt
</commit_message>
<xml_diff>
--- a/F3/f3_s02_grupo2.docx
+++ b/F3/f3_s02_grupo2.docx
@@ -1033,7 +1033,7 @@
     <w:p>
       <w:pPr>
         <w:spacing w:before="93"/>
-        <w:ind w:left="113" w:right="8051"/>
+        <w:ind w:left="113"/>
         <w:rPr>
           <w:b/>
         </w:rPr>
@@ -1043,7 +1043,7 @@
           <w:b/>
           <w:sz w:val="20"/>
         </w:rPr>
-        <w:t>Integrantes: Cristian Hurtado, Jorge Altamirano y Renzo Vilchez</w:t>
+        <w:t>Integrantes: Cristian Hurtado, Jorge Altamirano, Renzo Vilchez y Luis</w:t>
       </w:r>
     </w:p>
     <w:p>
@@ -1065,7 +1065,7 @@
     <w:p>
       <w:pPr>
         <w:spacing w:before="1"/>
-        <w:ind w:left="113" w:right="8051"/>
+        <w:ind w:left="113"/>
         <w:rPr>
           <w:b/>
         </w:rPr>
@@ -1099,7 +1099,7 @@
         <w:rPr>
           <w:sz w:val="20"/>
         </w:rPr>
-        <w:t>Fecha: 28 de septiembre de 2026</w:t>
+        <w:t>Fecha: 29 de septiembre de 2026</w:t>
       </w:r>
     </w:p>
     <w:p>
@@ -2004,7 +2004,7 @@
     </w:p>
     <w:p>
       <w:r>
-        <w:t>El avance contiene un notebook ejecutado, funciones separadas en un módulo, verificaciones de equivalencia, tres repeticiones por medición y una transformación nominal requerida por el docente. El diseño se ajusta al carácter de prototipo descrito en la guía de la Formativa 3 (Salinas Silva, 2026). La comparación de alternativas responde al tema del foro técnico de la Semana 1 (Universidad Andrés Bello, 2026); no se atribuye aquí una intervención específica del grupo.</w:t>
+        <w:t>El avance contiene un notebook ejecutado, funciones separadas en un módulo, verificaciones de equivalencia, tres repeticiones por medición y una transformación nominal requerida por el docente. El diseño se ajusta al carácter de prototipo descrito en la guía de la Formativa 3 (Salinas Silva, 2026). La consigna de la Formativa 2 plantea comparar programación estructurada y recursiva, tiempo y memoria (Universidad Andrés Bello, 2026); estas mediciones ofrecen ejemplos para esa discusión. A la fecha de este informe el grupo no había publicado una intervención en ese foro.</w:t>
       </w:r>
     </w:p>
     <w:p>
@@ -2231,7 +2231,7 @@
         <w:t>time.perf_counter()</w:t>
       </w:r>
       <w:r>
-        <w:t xml:space="preserve"> y se conservó el menor tiempo de tres repeticiones con el conjunto completo, conforme a la guía docente (Salinas Silva, 2026; Python Software Foundation, s. f.). Los tiempos describen esta ejecución en Python 3.13.5, pandas 2.2.3 y scikit-learn 1.6.1; pueden variar en otro equipo.</w:t>
+        <w:t xml:space="preserve"> y se conservó el menor tiempo de tres repeticiones con el conjunto completo, conforme a la guía docente (Salinas Silva, 2026; Python Software Foundation, s. f.). Los tiempos describen esta ejecución en Python 3.13.5, pandas 3.0.5, NumPy 2.5.2 y scikit-learn 1.9.0; pueden variar en otro equipo.</w:t>
       </w:r>
     </w:p>
     <w:tbl>
@@ -2362,14 +2362,8 @@
             <w:vAlign w:val="center"/>
           </w:tcPr>
           <w:p>
-            <w:pPr>
-              <w:spacing w:after="40"/>
-            </w:pPr>
             <w:r>
-              <w:rPr>
-                <w:sz w:val="18"/>
-              </w:rPr>
-              <w:t>Bucle: 0.144 s</w:t>
+              <w:t>Bucle: 0.1440 s</w:t>
             </w:r>
           </w:p>
         </w:tc>
@@ -2380,14 +2374,8 @@
             <w:vAlign w:val="center"/>
           </w:tcPr>
           <w:p>
-            <w:pPr>
-              <w:spacing w:after="40"/>
-            </w:pPr>
             <w:r>
-              <w:rPr>
-                <w:sz w:val="18"/>
-              </w:rPr>
-              <w:t>groupby: 0.009 s</w:t>
+              <w:t>groupby: 0.0101 s</w:t>
             </w:r>
           </w:p>
         </w:tc>
@@ -2436,14 +2424,8 @@
             <w:vAlign w:val="center"/>
           </w:tcPr>
           <w:p>
-            <w:pPr>
-              <w:spacing w:after="40"/>
-            </w:pPr>
             <w:r>
-              <w:rPr>
-                <w:sz w:val="18"/>
-              </w:rPr>
-              <w:t>25 columnas: 0.731 s</w:t>
+              <w:t>25 columnas: 0.9796 s</w:t>
             </w:r>
           </w:p>
         </w:tc>
@@ -2454,14 +2436,8 @@
             <w:vAlign w:val="center"/>
           </w:tcPr>
           <w:p>
-            <w:pPr>
-              <w:spacing w:after="40"/>
-            </w:pPr>
             <w:r>
-              <w:rPr>
-                <w:sz w:val="18"/>
-              </w:rPr>
-              <w:t>6 columnas: 0.495 s</w:t>
+              <w:t>6 columnas: 0.5712 s</w:t>
             </w:r>
           </w:p>
         </w:tc>
@@ -2510,13 +2486,7 @@
             <w:vAlign w:val="center"/>
           </w:tcPr>
           <w:p>
-            <w:pPr>
-              <w:spacing w:after="40"/>
-            </w:pPr>
             <w:r>
-              <w:rPr>
-                <w:sz w:val="18"/>
-              </w:rPr>
               <w:t>408.08 MB</w:t>
             </w:r>
           </w:p>
@@ -2528,13 +2498,7 @@
             <w:vAlign w:val="center"/>
           </w:tcPr>
           <w:p>
-            <w:pPr>
-              <w:spacing w:after="40"/>
-            </w:pPr>
             <w:r>
-              <w:rPr>
-                <w:sz w:val="18"/>
-              </w:rPr>
               <w:t>127.30 MB</w:t>
             </w:r>
           </w:p>
@@ -2571,7 +2535,7 @@
         <w:t>groupby</w:t>
       </w:r>
       <w:r>
-        <w:t xml:space="preserve"> fue 15.6 veces más rápido que el bucle. La lectura selectiva fue 1.5 veces más rápida y el DataFrame resultante ocupó 3.2 veces menos memoria. Se adopta </w:t>
+        <w:t xml:space="preserve"> fue 14.25 veces más rápido que el bucle. La lectura selectiva fue 1.71 veces más rápida y el DataFrame resultante ocupó 3.21 veces menos memoria. Se adopta </w:t>
       </w:r>
       <w:r>
         <w:rPr>
@@ -2634,7 +2598,7 @@
         <w:t>src/f2_utilidades.py</w:t>
       </w:r>
       <w:r>
-        <w:t>: su caso recursivo desciende en diccionarios anidados y su caso base registra un valor simple. No se emplea recursión sobre las filas de nacimientos, donde un recorrido o una agrupación son más adecuados. Esta distinción responde al criterio de pertinencia explicado en la guía docente (Salinas Silva, 2026).</w:t>
+        <w:t>: se aplicó a los metadatos reales de esta ejecución, que incluyen versiones, tiempos y parámetros de codificación. Su caso recursivo desciende en diccionarios anidados y su caso base registra un valor simple. No se emplea recursión sobre las filas de nacimientos, donde un recorrido o una agrupación son más adecuados. Esta distinción responde al criterio de pertinencia explicado en la guía docente (Salinas Silva, 2026).</w:t>
       </w:r>
     </w:p>
     <w:p>
@@ -2978,16 +2942,16 @@
     <w:p/>
     <w:p>
       <w:r>
-        <w:t xml:space="preserve">La arquitectura conserva F2 como referencia y añade F3 sin copiar sus CSV. El trabajo reside en la rama local </w:t>
+        <w:t xml:space="preserve">La arquitectura conserva F2 como referencia y añade F3 sin copiar sus CSV. El avance anterior de F3 se integró en GitHub mediante el pull request #5. Las correcciones de este informe y la nueva verificación de dependencias se prepararon en la rama local </w:t>
       </w:r>
       <w:r>
         <w:rPr>
           <w:i/>
         </w:rPr>
-        <w:t>branch-f3</w:t>
-      </w:r>
-      <w:r>
-        <w:t xml:space="preserve"> para revisión del equipo antes de integrarlo en GitHub. El historial de commits y la publicación remota corresponden al cierre grupal posterior a este borrador; por ello no se presentan como evidencia ya realizada.</w:t>
+        <w:t>ajustes-f3-requirements-cristian</w:t>
+      </w:r>
+      <w:r>
+        <w:t>; su revisión y publicación por el equipo siguen pendientes.</w:t>
       </w:r>
     </w:p>
     <w:p>
@@ -3023,7 +2987,7 @@
         <w:t>parametros_codificacion.json</w:t>
       </w:r>
       <w:r>
-        <w:t xml:space="preserve">. Para reproducirlo se abre la raíz del repositorio, se selecciona un kernel con pandas, NumPy y scikit-learn, y se ejecutan todas las celdas tras reiniciar. </w:t>
+        <w:t xml:space="preserve">. Para reproducirlo se abre la raíz del repositorio, se crea el entorno virtual con requirements.txt, se selecciona ese kernel y se ejecutan todas las celdas tras reiniciar. </w:t>
       </w:r>
       <w:r>
         <w:rPr>
@@ -3032,7 +2996,7 @@
         <w:t>F3/README.md</w:t>
       </w:r>
       <w:r>
-        <w:t xml:space="preserve"> contiene las instrucciones concretas. El archivo principal de dependencias declara versiones propuestas; las versiones efectivamente probadas están registradas en el cuaderno para evitar confundir ambas.</w:t>
+        <w:t xml:space="preserve"> contiene las instrucciones concretas. F1, F2 y F3 se ejecutaron sin errores con las versiones declaradas en el archivo principal de dependencias.</w:t>
       </w:r>
     </w:p>
     <w:p>
@@ -3071,6 +3035,7 @@
     </w:p>
     <w:p>
       <w:pPr>
+        <w:keepLines/>
         <w:ind w:left="397" w:hanging="397"/>
       </w:pPr>
       <w:r>
@@ -3088,6 +3053,7 @@
     </w:p>
     <w:p>
       <w:pPr>
+        <w:keepLines/>
         <w:ind w:left="397" w:hanging="397"/>
       </w:pPr>
       <w:r>
@@ -3105,6 +3071,7 @@
     </w:p>
     <w:p>
       <w:pPr>
+        <w:keepLines/>
         <w:ind w:left="397" w:hanging="397"/>
       </w:pPr>
       <w:r>
@@ -3122,6 +3089,7 @@
     </w:p>
     <w:p>
       <w:pPr>
+        <w:keepLines/>
         <w:ind w:left="397" w:hanging="397"/>
       </w:pPr>
       <w:r>
@@ -3139,6 +3107,7 @@
     </w:p>
     <w:p>
       <w:pPr>
+        <w:keepLines/>
         <w:ind w:left="397" w:hanging="397"/>
       </w:pPr>
       <w:r>
@@ -3156,6 +3125,7 @@
     </w:p>
     <w:p>
       <w:pPr>
+        <w:keepLines/>
         <w:ind w:left="397" w:hanging="397"/>
       </w:pPr>
       <w:r>

</xml_diff>

<commit_message>
F3: update con participación en el foro
</commit_message>
<xml_diff>
--- a/F3/f3_s02_grupo2.docx
+++ b/F3/f3_s02_grupo2.docx
@@ -1043,7 +1043,7 @@
           <w:b/>
           <w:sz w:val="20"/>
         </w:rPr>
-        <w:t>Integrantes: Cristian Hurtado, Jorge Altamirano, Renzo Vilchez y Luis</w:t>
+        <w:t>Integrantes: Cristian Hurtado, Jorge Altamirano, Renzo Vilchez y Luis Paredes</w:t>
       </w:r>
     </w:p>
     <w:p>
@@ -1963,7 +1963,7 @@
             <w:noProof/>
             <w:webHidden/>
           </w:rPr>
-          <w:t>5</w:t>
+          <w:t>6</w:t>
         </w:r>
         <w:r>
           <w:rPr>
@@ -2004,7 +2004,7 @@
     </w:p>
     <w:p>
       <w:r>
-        <w:t>El avance contiene un notebook ejecutado, funciones separadas en un módulo, verificaciones de equivalencia, tres repeticiones por medición y una transformación nominal requerida por el docente. El diseño se ajusta al carácter de prototipo descrito en la guía de la Formativa 3 (Salinas Silva, 2026). La consigna de la Formativa 2 plantea comparar programación estructurada y recursiva, tiempo y memoria (Universidad Andrés Bello, 2026); estas mediciones ofrecen ejemplos para esa discusión. A la fecha de este informe el grupo no había publicado una intervención en ese foro.</w:t>
+        <w:t>El avance contiene un notebook ejecutado, funciones separadas en un módulo, verificaciones de equivalencia, tres repeticiones por medición y una transformación nominal requerida por el docente. El diseño se ajusta al carácter de prototipo descrito en la guía de la Formativa 3 (Salinas Silva, 2026). La consigna de la Formativa 2 plantea comparar programación estructurada y recursiva, tiempo y memoria (Universidad Andrés Bello, 2026). En su intervención inicial del 29 de septiembre, Cristian Hurtado Cabezas distinguió el procesamiento tabular de la recursividad sobre metadatos anidados y propuso verificar resultados equivalentes antes de comparar tiempo y memoria. Este avance aplica esos criterios.</w:t>
       </w:r>
     </w:p>
     <w:p>
@@ -2942,17 +2942,14 @@
     <w:p/>
     <w:p>
       <w:r>
-        <w:t xml:space="preserve">La arquitectura conserva F2 como referencia y añade F3 sin copiar sus CSV. El avance anterior de F3 se integró en GitHub mediante el pull request #5. Las correcciones de este informe y la nueva verificación de dependencias se prepararon en la rama local </w:t>
+        <w:t>La arquitectura conserva F2 como referencia y añade F3 sin copiar sus CSV. El avance está publicado en una rama del repositorio del grupo para revisión mediante un pull request. Su integración a main queda sujeta a la revisión del equipo.</w:t>
       </w:r>
       <w:r>
         <w:rPr>
           <w:i/>
         </w:rPr>
-        <w:t>ajustes-f3-requirements-cristian</w:t>
-      </w:r>
-      <w:r>
-        <w:t>; su revisión y publicación por el equipo siguen pendientes.</w:t>
-      </w:r>
+      </w:r>
+      <w:r/>
     </w:p>
     <w:p>
       <w:pPr>
@@ -3023,6 +3020,7 @@
     <w:p>
       <w:pPr>
         <w:pStyle w:val="Heading11"/>
+        <w:pageBreakBefore/>
       </w:pPr>
       <w:bookmarkStart w:id="10" w:name="_Toc241516786"/>
       <w:r>

</xml_diff>

<commit_message>
Se actualizaron los informes del f3
</commit_message>
<xml_diff>
--- a/F3/f3_s02_grupo2.docx
+++ b/F3/f3_s02_grupo2.docx
@@ -11,7 +11,6 @@
       </w:pPr>
       <w:r>
         <w:rPr>
-          <w:noProof/>
           <w:position w:val="1"/>
           <w:sz w:val="20"/>
         </w:rPr>
@@ -61,7 +60,6 @@
       </w:r>
       <w:r>
         <w:rPr>
-          <w:noProof/>
           <w:spacing w:val="63"/>
           <w:sz w:val="20"/>
         </w:rPr>
@@ -807,7 +805,7 @@
               </wp:inline>
             </w:drawing>
           </mc:Choice>
-          <mc:Fallback xmlns:a="http://schemas.openxmlformats.org/drawingml/2006/main" xmlns:pic="http://schemas.openxmlformats.org/drawingml/2006/picture">
+          <mc:Fallback xmlns:pic="http://schemas.openxmlformats.org/drawingml/2006/picture" xmlns:a="http://schemas.openxmlformats.org/drawingml/2006/main">
             <w:pict>
               <v:group id="Group 2" style="width:85.45pt;height:51.55pt;mso-position-horizontal-relative:char;mso-position-vertical-relative:line" coordsize="10852,6546" o:spid="_x0000_s1026" w14:anchorId="7A8A23C6" o:gfxdata="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">
                 <v:shape id="Graphic 3" style="position:absolute;left:122;top:167;width:2101;height:3099;visibility:visible;mso-wrap-style:square;v-text-anchor:top" coordsize="210185,309880" o:spid="_x0000_s1027" fillcolor="#c6c4c4" stroked="f" path="m209791,l188086,r,184061l181850,232548r-17516,33480l137327,285432r-34712,6261l71098,285811,45396,267038,28085,233684,21742,184061,21742,,,,,185381r8392,58937l30862,282681r32483,20806l101777,309753r41068,-6762l177287,281095r23690,-39451l209791,182219,209791,xe" o:gfxdata="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">
@@ -865,7 +863,7 @@
     </w:p>
     <w:p>
       <w:pPr>
-        <w:pStyle w:val="BodyText"/>
+        <w:pStyle w:val="Textoindependiente"/>
         <w:rPr>
           <w:sz w:val="20"/>
         </w:rPr>
@@ -873,7 +871,7 @@
     </w:p>
     <w:p>
       <w:pPr>
-        <w:pStyle w:val="BodyText"/>
+        <w:pStyle w:val="Textoindependiente"/>
         <w:rPr>
           <w:sz w:val="20"/>
         </w:rPr>
@@ -881,7 +879,7 @@
     </w:p>
     <w:p>
       <w:pPr>
-        <w:pStyle w:val="BodyText"/>
+        <w:pStyle w:val="Textoindependiente"/>
         <w:rPr>
           <w:sz w:val="20"/>
         </w:rPr>
@@ -889,7 +887,7 @@
     </w:p>
     <w:p>
       <w:pPr>
-        <w:pStyle w:val="BodyText"/>
+        <w:pStyle w:val="Textoindependiente"/>
         <w:rPr>
           <w:sz w:val="20"/>
         </w:rPr>
@@ -897,7 +895,7 @@
     </w:p>
     <w:p>
       <w:pPr>
-        <w:pStyle w:val="BodyText"/>
+        <w:pStyle w:val="Textoindependiente"/>
         <w:rPr>
           <w:sz w:val="20"/>
         </w:rPr>
@@ -905,7 +903,7 @@
     </w:p>
     <w:p>
       <w:pPr>
-        <w:pStyle w:val="BodyText"/>
+        <w:pStyle w:val="Textoindependiente"/>
         <w:rPr>
           <w:sz w:val="20"/>
         </w:rPr>
@@ -913,7 +911,7 @@
     </w:p>
     <w:p>
       <w:pPr>
-        <w:pStyle w:val="BodyText"/>
+        <w:pStyle w:val="Textoindependiente"/>
         <w:spacing w:before="4"/>
         <w:rPr>
           <w:sz w:val="26"/>
@@ -935,7 +933,6 @@
           <w:bCs/>
           <w:sz w:val="72"/>
           <w:szCs w:val="72"/>
-          <w:lang w:val="es-CL"/>
         </w:rPr>
       </w:pPr>
       <w:r>
@@ -960,7 +957,6 @@
           <w:b/>
           <w:sz w:val="72"/>
           <w:szCs w:val="72"/>
-          <w:lang w:val="es-CL"/>
         </w:rPr>
       </w:pPr>
       <w:r>
@@ -997,7 +993,7 @@
     </w:p>
     <w:p>
       <w:pPr>
-        <w:pStyle w:val="BodyText"/>
+        <w:pStyle w:val="Textoindependiente"/>
         <w:rPr>
           <w:b/>
           <w:sz w:val="20"/>
@@ -1013,7 +1009,7 @@
     </w:p>
     <w:p>
       <w:pPr>
-        <w:pStyle w:val="BodyText"/>
+        <w:pStyle w:val="Textoindependiente"/>
         <w:rPr>
           <w:b/>
           <w:sz w:val="20"/>
@@ -1022,7 +1018,7 @@
     </w:p>
     <w:p>
       <w:pPr>
-        <w:pStyle w:val="BodyText"/>
+        <w:pStyle w:val="Textoindependiente"/>
         <w:spacing w:before="1"/>
         <w:rPr>
           <w:b/>
@@ -1048,8 +1044,8 @@
     </w:p>
     <w:p>
       <w:pPr>
-        <w:pStyle w:val="BodyText"/>
-        <w:spacing w:before="8"/>
+        <w:spacing w:before="1"/>
+        <w:ind w:left="113"/>
         <w:rPr>
           <w:b/>
           <w:sz w:val="19"/>
@@ -1079,7 +1075,7 @@
     </w:p>
     <w:p>
       <w:pPr>
-        <w:pStyle w:val="BodyText"/>
+        <w:pStyle w:val="Textoindependiente"/>
         <w:spacing w:before="9"/>
         <w:rPr>
           <w:b/>
@@ -1115,7 +1111,7 @@
     </w:p>
     <w:p>
       <w:pPr>
-        <w:pStyle w:val="BodyText"/>
+        <w:pStyle w:val="Textoindependiente"/>
         <w:rPr>
           <w:b/>
           <w:sz w:val="9"/>
@@ -1142,18 +1138,17 @@
     </w:p>
     <w:p>
       <w:pPr>
-        <w:pStyle w:val="TOC1"/>
+        <w:pStyle w:val="TDC1"/>
         <w:tabs>
           <w:tab w:val="right" w:leader="dot" w:pos="10370"/>
         </w:tabs>
         <w:rPr>
           <w:rFonts w:asciiTheme="minorHAnsi" w:eastAsiaTheme="minorEastAsia" w:hAnsiTheme="minorHAnsi" w:cstheme="minorBidi"/>
-          <w:noProof/>
           <w:color w:val="auto"/>
           <w:kern w:val="2"/>
           <w:sz w:val="24"/>
           <w:szCs w:val="24"/>
-          <w:lang w:val="en-US"/>
+          <w:lang w:eastAsia="es-CL"/>
           <w14:ligatures w14:val="standardContextual"/>
         </w:rPr>
       </w:pPr>
@@ -1166,58 +1161,50 @@
       <w:r>
         <w:fldChar w:fldCharType="separate"/>
       </w:r>
-      <w:hyperlink w:anchor="_Toc241516776" w:history="1">
-        <w:r>
-          <w:rPr>
-            <w:rStyle w:val="Hyperlink"/>
-            <w:noProof/>
+      <w:hyperlink w:anchor="_Toc241593817" w:history="1">
+        <w:r>
+          <w:rPr>
+            <w:rStyle w:val="Hipervnculo"/>
           </w:rPr>
           <w:t>1. Introducción y alcance del avance</w:t>
         </w:r>
         <w:r>
           <w:rPr>
-            <w:noProof/>
             <w:webHidden/>
           </w:rPr>
           <w:tab/>
         </w:r>
         <w:r>
           <w:rPr>
-            <w:noProof/>
             <w:webHidden/>
           </w:rPr>
           <w:fldChar w:fldCharType="begin"/>
         </w:r>
         <w:r>
           <w:rPr>
-            <w:noProof/>
-            <w:webHidden/>
-          </w:rPr>
-          <w:instrText xml:space="preserve"> PAGEREF _Toc241516776 \h </w:instrText>
-        </w:r>
-        <w:r>
-          <w:rPr>
-            <w:noProof/>
-            <w:webHidden/>
-          </w:rPr>
-        </w:r>
-        <w:r>
-          <w:rPr>
-            <w:noProof/>
+            <w:webHidden/>
+          </w:rPr>
+          <w:instrText xml:space="preserve"> PAGEREF _Toc241593817 \h </w:instrText>
+        </w:r>
+        <w:r>
+          <w:rPr>
+            <w:webHidden/>
+          </w:rPr>
+        </w:r>
+        <w:r>
+          <w:rPr>
             <w:webHidden/>
           </w:rPr>
           <w:fldChar w:fldCharType="separate"/>
         </w:r>
         <w:r>
           <w:rPr>
-            <w:noProof/>
             <w:webHidden/>
           </w:rPr>
           <w:t>3</w:t>
         </w:r>
         <w:r>
           <w:rPr>
-            <w:noProof/>
             <w:webHidden/>
           </w:rPr>
           <w:fldChar w:fldCharType="end"/>
@@ -1226,73 +1213,64 @@
     </w:p>
     <w:p>
       <w:pPr>
-        <w:pStyle w:val="TOC1"/>
+        <w:pStyle w:val="TDC1"/>
         <w:tabs>
           <w:tab w:val="right" w:leader="dot" w:pos="10370"/>
         </w:tabs>
         <w:rPr>
           <w:rFonts w:asciiTheme="minorHAnsi" w:eastAsiaTheme="minorEastAsia" w:hAnsiTheme="minorHAnsi" w:cstheme="minorBidi"/>
-          <w:noProof/>
           <w:color w:val="auto"/>
           <w:kern w:val="2"/>
           <w:sz w:val="24"/>
           <w:szCs w:val="24"/>
-          <w:lang w:val="en-US"/>
+          <w:lang w:eastAsia="es-CL"/>
           <w14:ligatures w14:val="standardContextual"/>
         </w:rPr>
       </w:pPr>
-      <w:hyperlink w:anchor="_Toc241516777" w:history="1">
-        <w:r>
-          <w:rPr>
-            <w:rStyle w:val="Hyperlink"/>
-            <w:noProof/>
+      <w:hyperlink w:anchor="_Toc241593818" w:history="1">
+        <w:r>
+          <w:rPr>
+            <w:rStyle w:val="Hipervnculo"/>
           </w:rPr>
           <w:t>2. Codificación funcional y arquitectura básica</w:t>
         </w:r>
         <w:r>
           <w:rPr>
-            <w:noProof/>
             <w:webHidden/>
           </w:rPr>
           <w:tab/>
         </w:r>
         <w:r>
           <w:rPr>
-            <w:noProof/>
             <w:webHidden/>
           </w:rPr>
           <w:fldChar w:fldCharType="begin"/>
         </w:r>
         <w:r>
           <w:rPr>
-            <w:noProof/>
-            <w:webHidden/>
-          </w:rPr>
-          <w:instrText xml:space="preserve"> PAGEREF _Toc241516777 \h </w:instrText>
-        </w:r>
-        <w:r>
-          <w:rPr>
-            <w:noProof/>
-            <w:webHidden/>
-          </w:rPr>
-        </w:r>
-        <w:r>
-          <w:rPr>
-            <w:noProof/>
+            <w:webHidden/>
+          </w:rPr>
+          <w:instrText xml:space="preserve"> PAGEREF _Toc241593818 \h </w:instrText>
+        </w:r>
+        <w:r>
+          <w:rPr>
+            <w:webHidden/>
+          </w:rPr>
+        </w:r>
+        <w:r>
+          <w:rPr>
             <w:webHidden/>
           </w:rPr>
           <w:fldChar w:fldCharType="separate"/>
         </w:r>
         <w:r>
           <w:rPr>
-            <w:noProof/>
             <w:webHidden/>
           </w:rPr>
           <w:t>3</w:t>
         </w:r>
         <w:r>
           <w:rPr>
-            <w:noProof/>
             <w:webHidden/>
           </w:rPr>
           <w:fldChar w:fldCharType="end"/>
@@ -1301,73 +1279,64 @@
     </w:p>
     <w:p>
       <w:pPr>
-        <w:pStyle w:val="TOC1"/>
+        <w:pStyle w:val="TDC1"/>
         <w:tabs>
           <w:tab w:val="right" w:leader="dot" w:pos="10370"/>
         </w:tabs>
         <w:rPr>
           <w:rFonts w:asciiTheme="minorHAnsi" w:eastAsiaTheme="minorEastAsia" w:hAnsiTheme="minorHAnsi" w:cstheme="minorBidi"/>
-          <w:noProof/>
           <w:color w:val="auto"/>
           <w:kern w:val="2"/>
           <w:sz w:val="24"/>
           <w:szCs w:val="24"/>
-          <w:lang w:val="en-US"/>
+          <w:lang w:eastAsia="es-CL"/>
           <w14:ligatures w14:val="standardContextual"/>
         </w:rPr>
       </w:pPr>
-      <w:hyperlink w:anchor="_Toc241516778" w:history="1">
-        <w:r>
-          <w:rPr>
-            <w:rStyle w:val="Hyperlink"/>
-            <w:noProof/>
+      <w:hyperlink w:anchor="_Toc241593819" w:history="1">
+        <w:r>
+          <w:rPr>
+            <w:rStyle w:val="Hipervnculo"/>
           </w:rPr>
           <w:t>3. Preprocesamiento y transformación del dataset</w:t>
         </w:r>
         <w:r>
           <w:rPr>
-            <w:noProof/>
             <w:webHidden/>
           </w:rPr>
           <w:tab/>
         </w:r>
         <w:r>
           <w:rPr>
-            <w:noProof/>
             <w:webHidden/>
           </w:rPr>
           <w:fldChar w:fldCharType="begin"/>
         </w:r>
         <w:r>
           <w:rPr>
-            <w:noProof/>
-            <w:webHidden/>
-          </w:rPr>
-          <w:instrText xml:space="preserve"> PAGEREF _Toc241516778 \h </w:instrText>
-        </w:r>
-        <w:r>
-          <w:rPr>
-            <w:noProof/>
-            <w:webHidden/>
-          </w:rPr>
-        </w:r>
-        <w:r>
-          <w:rPr>
-            <w:noProof/>
+            <w:webHidden/>
+          </w:rPr>
+          <w:instrText xml:space="preserve"> PAGEREF _Toc241593819 \h </w:instrText>
+        </w:r>
+        <w:r>
+          <w:rPr>
+            <w:webHidden/>
+          </w:rPr>
+        </w:r>
+        <w:r>
+          <w:rPr>
             <w:webHidden/>
           </w:rPr>
           <w:fldChar w:fldCharType="separate"/>
         </w:r>
         <w:r>
           <w:rPr>
-            <w:noProof/>
             <w:webHidden/>
           </w:rPr>
           <w:t>3</w:t>
         </w:r>
         <w:r>
           <w:rPr>
-            <w:noProof/>
             <w:webHidden/>
           </w:rPr>
           <w:fldChar w:fldCharType="end"/>
@@ -1376,73 +1345,64 @@
     </w:p>
     <w:p>
       <w:pPr>
-        <w:pStyle w:val="TOC1"/>
+        <w:pStyle w:val="TDC1"/>
         <w:tabs>
           <w:tab w:val="right" w:leader="dot" w:pos="10370"/>
         </w:tabs>
         <w:rPr>
           <w:rFonts w:asciiTheme="minorHAnsi" w:eastAsiaTheme="minorEastAsia" w:hAnsiTheme="minorHAnsi" w:cstheme="minorBidi"/>
-          <w:noProof/>
           <w:color w:val="auto"/>
           <w:kern w:val="2"/>
           <w:sz w:val="24"/>
           <w:szCs w:val="24"/>
-          <w:lang w:val="en-US"/>
+          <w:lang w:eastAsia="es-CL"/>
           <w14:ligatures w14:val="standardContextual"/>
         </w:rPr>
       </w:pPr>
-      <w:hyperlink w:anchor="_Toc241516779" w:history="1">
-        <w:r>
-          <w:rPr>
-            <w:rStyle w:val="Hyperlink"/>
-            <w:noProof/>
+      <w:hyperlink w:anchor="_Toc241593820" w:history="1">
+        <w:r>
+          <w:rPr>
+            <w:rStyle w:val="Hipervnculo"/>
           </w:rPr>
           <w:t>4. Validación técnica y verificación</w:t>
         </w:r>
         <w:r>
           <w:rPr>
-            <w:noProof/>
             <w:webHidden/>
           </w:rPr>
           <w:tab/>
         </w:r>
         <w:r>
           <w:rPr>
-            <w:noProof/>
             <w:webHidden/>
           </w:rPr>
           <w:fldChar w:fldCharType="begin"/>
         </w:r>
         <w:r>
           <w:rPr>
-            <w:noProof/>
-            <w:webHidden/>
-          </w:rPr>
-          <w:instrText xml:space="preserve"> PAGEREF _Toc241516779 \h </w:instrText>
-        </w:r>
-        <w:r>
-          <w:rPr>
-            <w:noProof/>
-            <w:webHidden/>
-          </w:rPr>
-        </w:r>
-        <w:r>
-          <w:rPr>
-            <w:noProof/>
+            <w:webHidden/>
+          </w:rPr>
+          <w:instrText xml:space="preserve"> PAGEREF _Toc241593820 \h </w:instrText>
+        </w:r>
+        <w:r>
+          <w:rPr>
+            <w:webHidden/>
+          </w:rPr>
+        </w:r>
+        <w:r>
+          <w:rPr>
             <w:webHidden/>
           </w:rPr>
           <w:fldChar w:fldCharType="separate"/>
         </w:r>
         <w:r>
           <w:rPr>
-            <w:noProof/>
             <w:webHidden/>
           </w:rPr>
           <w:t>4</w:t>
         </w:r>
         <w:r>
           <w:rPr>
-            <w:noProof/>
             <w:webHidden/>
           </w:rPr>
           <w:fldChar w:fldCharType="end"/>
@@ -1451,73 +1411,64 @@
     </w:p>
     <w:p>
       <w:pPr>
-        <w:pStyle w:val="TOC1"/>
+        <w:pStyle w:val="TDC1"/>
         <w:tabs>
           <w:tab w:val="right" w:leader="dot" w:pos="10370"/>
         </w:tabs>
         <w:rPr>
           <w:rFonts w:asciiTheme="minorHAnsi" w:eastAsiaTheme="minorEastAsia" w:hAnsiTheme="minorHAnsi" w:cstheme="minorBidi"/>
-          <w:noProof/>
           <w:color w:val="auto"/>
           <w:kern w:val="2"/>
           <w:sz w:val="24"/>
           <w:szCs w:val="24"/>
-          <w:lang w:val="en-US"/>
+          <w:lang w:eastAsia="es-CL"/>
           <w14:ligatures w14:val="standardContextual"/>
         </w:rPr>
       </w:pPr>
-      <w:hyperlink w:anchor="_Toc241516780" w:history="1">
-        <w:r>
-          <w:rPr>
-            <w:rStyle w:val="Hyperlink"/>
-            <w:noProof/>
+      <w:hyperlink w:anchor="_Toc241593821" w:history="1">
+        <w:r>
+          <w:rPr>
+            <w:rStyle w:val="Hipervnculo"/>
           </w:rPr>
           <w:t>5. Eficiencia y optimización</w:t>
         </w:r>
         <w:r>
           <w:rPr>
-            <w:noProof/>
             <w:webHidden/>
           </w:rPr>
           <w:tab/>
         </w:r>
         <w:r>
           <w:rPr>
-            <w:noProof/>
             <w:webHidden/>
           </w:rPr>
           <w:fldChar w:fldCharType="begin"/>
         </w:r>
         <w:r>
           <w:rPr>
-            <w:noProof/>
-            <w:webHidden/>
-          </w:rPr>
-          <w:instrText xml:space="preserve"> PAGEREF _Toc241516780 \h </w:instrText>
-        </w:r>
-        <w:r>
-          <w:rPr>
-            <w:noProof/>
-            <w:webHidden/>
-          </w:rPr>
-        </w:r>
-        <w:r>
-          <w:rPr>
-            <w:noProof/>
+            <w:webHidden/>
+          </w:rPr>
+          <w:instrText xml:space="preserve"> PAGEREF _Toc241593821 \h </w:instrText>
+        </w:r>
+        <w:r>
+          <w:rPr>
+            <w:webHidden/>
+          </w:rPr>
+        </w:r>
+        <w:r>
+          <w:rPr>
             <w:webHidden/>
           </w:rPr>
           <w:fldChar w:fldCharType="separate"/>
         </w:r>
         <w:r>
           <w:rPr>
-            <w:noProof/>
             <w:webHidden/>
           </w:rPr>
           <w:t>4</w:t>
         </w:r>
         <w:r>
           <w:rPr>
-            <w:noProof/>
             <w:webHidden/>
           </w:rPr>
           <w:fldChar w:fldCharType="end"/>
@@ -1526,73 +1477,64 @@
     </w:p>
     <w:p>
       <w:pPr>
-        <w:pStyle w:val="TOC1"/>
+        <w:pStyle w:val="TDC1"/>
         <w:tabs>
           <w:tab w:val="right" w:leader="dot" w:pos="10370"/>
         </w:tabs>
         <w:rPr>
           <w:rFonts w:asciiTheme="minorHAnsi" w:eastAsiaTheme="minorEastAsia" w:hAnsiTheme="minorHAnsi" w:cstheme="minorBidi"/>
-          <w:noProof/>
           <w:color w:val="auto"/>
           <w:kern w:val="2"/>
           <w:sz w:val="24"/>
           <w:szCs w:val="24"/>
-          <w:lang w:val="en-US"/>
+          <w:lang w:eastAsia="es-CL"/>
           <w14:ligatures w14:val="standardContextual"/>
         </w:rPr>
       </w:pPr>
-      <w:hyperlink w:anchor="_Toc241516781" w:history="1">
-        <w:r>
-          <w:rPr>
-            <w:rStyle w:val="Hyperlink"/>
-            <w:noProof/>
+      <w:hyperlink w:anchor="_Toc241593822" w:history="1">
+        <w:r>
+          <w:rPr>
+            <w:rStyle w:val="Hipervnculo"/>
           </w:rPr>
           <w:t>6. Diseño estructurado y modularidad</w:t>
         </w:r>
         <w:r>
           <w:rPr>
-            <w:noProof/>
             <w:webHidden/>
           </w:rPr>
           <w:tab/>
         </w:r>
         <w:r>
           <w:rPr>
-            <w:noProof/>
             <w:webHidden/>
           </w:rPr>
           <w:fldChar w:fldCharType="begin"/>
         </w:r>
         <w:r>
           <w:rPr>
-            <w:noProof/>
-            <w:webHidden/>
-          </w:rPr>
-          <w:instrText xml:space="preserve"> PAGEREF _Toc241516781 \h </w:instrText>
-        </w:r>
-        <w:r>
-          <w:rPr>
-            <w:noProof/>
-            <w:webHidden/>
-          </w:rPr>
-        </w:r>
-        <w:r>
-          <w:rPr>
-            <w:noProof/>
+            <w:webHidden/>
+          </w:rPr>
+          <w:instrText xml:space="preserve"> PAGEREF _Toc241593822 \h </w:instrText>
+        </w:r>
+        <w:r>
+          <w:rPr>
+            <w:webHidden/>
+          </w:rPr>
+        </w:r>
+        <w:r>
+          <w:rPr>
             <w:webHidden/>
           </w:rPr>
           <w:fldChar w:fldCharType="separate"/>
         </w:r>
         <w:r>
           <w:rPr>
-            <w:noProof/>
             <w:webHidden/>
           </w:rPr>
           <w:t>4</w:t>
         </w:r>
         <w:r>
           <w:rPr>
-            <w:noProof/>
             <w:webHidden/>
           </w:rPr>
           <w:fldChar w:fldCharType="end"/>
@@ -1601,73 +1543,64 @@
     </w:p>
     <w:p>
       <w:pPr>
-        <w:pStyle w:val="TOC1"/>
+        <w:pStyle w:val="TDC1"/>
         <w:tabs>
           <w:tab w:val="right" w:leader="dot" w:pos="10370"/>
         </w:tabs>
         <w:rPr>
           <w:rFonts w:asciiTheme="minorHAnsi" w:eastAsiaTheme="minorEastAsia" w:hAnsiTheme="minorHAnsi" w:cstheme="minorBidi"/>
-          <w:noProof/>
           <w:color w:val="auto"/>
           <w:kern w:val="2"/>
           <w:sz w:val="24"/>
           <w:szCs w:val="24"/>
-          <w:lang w:val="en-US"/>
+          <w:lang w:eastAsia="es-CL"/>
           <w14:ligatures w14:val="standardContextual"/>
         </w:rPr>
       </w:pPr>
-      <w:hyperlink w:anchor="_Toc241516782" w:history="1">
-        <w:r>
-          <w:rPr>
-            <w:rStyle w:val="Hyperlink"/>
-            <w:noProof/>
+      <w:hyperlink w:anchor="_Toc241593823" w:history="1">
+        <w:r>
+          <w:rPr>
+            <w:rStyle w:val="Hipervnculo"/>
           </w:rPr>
           <w:t>7. Implementación modular y programación orientada a objetos</w:t>
         </w:r>
         <w:r>
           <w:rPr>
-            <w:noProof/>
             <w:webHidden/>
           </w:rPr>
           <w:tab/>
         </w:r>
         <w:r>
           <w:rPr>
-            <w:noProof/>
             <w:webHidden/>
           </w:rPr>
           <w:fldChar w:fldCharType="begin"/>
         </w:r>
         <w:r>
           <w:rPr>
-            <w:noProof/>
-            <w:webHidden/>
-          </w:rPr>
-          <w:instrText xml:space="preserve"> PAGEREF _Toc241516782 \h </w:instrText>
-        </w:r>
-        <w:r>
-          <w:rPr>
-            <w:noProof/>
-            <w:webHidden/>
-          </w:rPr>
-        </w:r>
-        <w:r>
-          <w:rPr>
-            <w:noProof/>
+            <w:webHidden/>
+          </w:rPr>
+          <w:instrText xml:space="preserve"> PAGEREF _Toc241593823 \h </w:instrText>
+        </w:r>
+        <w:r>
+          <w:rPr>
+            <w:webHidden/>
+          </w:rPr>
+        </w:r>
+        <w:r>
+          <w:rPr>
             <w:webHidden/>
           </w:rPr>
           <w:fldChar w:fldCharType="separate"/>
         </w:r>
         <w:r>
           <w:rPr>
-            <w:noProof/>
             <w:webHidden/>
           </w:rPr>
           <w:t>4</w:t>
         </w:r>
         <w:r>
           <w:rPr>
-            <w:noProof/>
             <w:webHidden/>
           </w:rPr>
           <w:fldChar w:fldCharType="end"/>
@@ -1676,73 +1609,64 @@
     </w:p>
     <w:p>
       <w:pPr>
-        <w:pStyle w:val="TOC1"/>
+        <w:pStyle w:val="TDC1"/>
         <w:tabs>
           <w:tab w:val="right" w:leader="dot" w:pos="10370"/>
         </w:tabs>
         <w:rPr>
           <w:rFonts w:asciiTheme="minorHAnsi" w:eastAsiaTheme="minorEastAsia" w:hAnsiTheme="minorHAnsi" w:cstheme="minorBidi"/>
-          <w:noProof/>
           <w:color w:val="auto"/>
           <w:kern w:val="2"/>
           <w:sz w:val="24"/>
           <w:szCs w:val="24"/>
-          <w:lang w:val="en-US"/>
+          <w:lang w:eastAsia="es-CL"/>
           <w14:ligatures w14:val="standardContextual"/>
         </w:rPr>
       </w:pPr>
-      <w:hyperlink w:anchor="_Toc241516783" w:history="1">
-        <w:r>
-          <w:rPr>
-            <w:rStyle w:val="Hyperlink"/>
-            <w:noProof/>
+      <w:hyperlink w:anchor="_Toc241593824" w:history="1">
+        <w:r>
+          <w:rPr>
+            <w:rStyle w:val="Hipervnculo"/>
           </w:rPr>
           <w:t>8. Documentación de arquitectura y repositorio</w:t>
         </w:r>
         <w:r>
           <w:rPr>
-            <w:noProof/>
             <w:webHidden/>
           </w:rPr>
           <w:tab/>
         </w:r>
         <w:r>
           <w:rPr>
-            <w:noProof/>
             <w:webHidden/>
           </w:rPr>
           <w:fldChar w:fldCharType="begin"/>
         </w:r>
         <w:r>
           <w:rPr>
-            <w:noProof/>
-            <w:webHidden/>
-          </w:rPr>
-          <w:instrText xml:space="preserve"> PAGEREF _Toc241516783 \h </w:instrText>
-        </w:r>
-        <w:r>
-          <w:rPr>
-            <w:noProof/>
-            <w:webHidden/>
-          </w:rPr>
-        </w:r>
-        <w:r>
-          <w:rPr>
-            <w:noProof/>
+            <w:webHidden/>
+          </w:rPr>
+          <w:instrText xml:space="preserve"> PAGEREF _Toc241593824 \h </w:instrText>
+        </w:r>
+        <w:r>
+          <w:rPr>
+            <w:webHidden/>
+          </w:rPr>
+        </w:r>
+        <w:r>
+          <w:rPr>
             <w:webHidden/>
           </w:rPr>
           <w:fldChar w:fldCharType="separate"/>
         </w:r>
         <w:r>
           <w:rPr>
-            <w:noProof/>
-            <w:webHidden/>
-          </w:rPr>
-          <w:t>4</w:t>
-        </w:r>
-        <w:r>
-          <w:rPr>
-            <w:noProof/>
+            <w:webHidden/>
+          </w:rPr>
+          <w:t>5</w:t>
+        </w:r>
+        <w:r>
+          <w:rPr>
             <w:webHidden/>
           </w:rPr>
           <w:fldChar w:fldCharType="end"/>
@@ -1751,73 +1675,64 @@
     </w:p>
     <w:p>
       <w:pPr>
-        <w:pStyle w:val="TOC1"/>
+        <w:pStyle w:val="TDC1"/>
         <w:tabs>
           <w:tab w:val="right" w:leader="dot" w:pos="10370"/>
         </w:tabs>
         <w:rPr>
           <w:rFonts w:asciiTheme="minorHAnsi" w:eastAsiaTheme="minorEastAsia" w:hAnsiTheme="minorHAnsi" w:cstheme="minorBidi"/>
-          <w:noProof/>
           <w:color w:val="auto"/>
           <w:kern w:val="2"/>
           <w:sz w:val="24"/>
           <w:szCs w:val="24"/>
-          <w:lang w:val="en-US"/>
+          <w:lang w:eastAsia="es-CL"/>
           <w14:ligatures w14:val="standardContextual"/>
         </w:rPr>
       </w:pPr>
-      <w:hyperlink w:anchor="_Toc241516784" w:history="1">
-        <w:r>
-          <w:rPr>
-            <w:rStyle w:val="Hyperlink"/>
-            <w:noProof/>
+      <w:hyperlink w:anchor="_Toc241593825" w:history="1">
+        <w:r>
+          <w:rPr>
+            <w:rStyle w:val="Hipervnculo"/>
           </w:rPr>
           <w:t>9. Notebook ejecutado y reproducibilidad</w:t>
         </w:r>
         <w:r>
           <w:rPr>
-            <w:noProof/>
             <w:webHidden/>
           </w:rPr>
           <w:tab/>
         </w:r>
         <w:r>
           <w:rPr>
-            <w:noProof/>
             <w:webHidden/>
           </w:rPr>
           <w:fldChar w:fldCharType="begin"/>
         </w:r>
         <w:r>
           <w:rPr>
-            <w:noProof/>
-            <w:webHidden/>
-          </w:rPr>
-          <w:instrText xml:space="preserve"> PAGEREF _Toc241516784 \h </w:instrText>
-        </w:r>
-        <w:r>
-          <w:rPr>
-            <w:noProof/>
-            <w:webHidden/>
-          </w:rPr>
-        </w:r>
-        <w:r>
-          <w:rPr>
-            <w:noProof/>
+            <w:webHidden/>
+          </w:rPr>
+          <w:instrText xml:space="preserve"> PAGEREF _Toc241593825 \h </w:instrText>
+        </w:r>
+        <w:r>
+          <w:rPr>
+            <w:webHidden/>
+          </w:rPr>
+        </w:r>
+        <w:r>
+          <w:rPr>
             <w:webHidden/>
           </w:rPr>
           <w:fldChar w:fldCharType="separate"/>
         </w:r>
         <w:r>
           <w:rPr>
-            <w:noProof/>
             <w:webHidden/>
           </w:rPr>
           <w:t>5</w:t>
         </w:r>
         <w:r>
           <w:rPr>
-            <w:noProof/>
             <w:webHidden/>
           </w:rPr>
           <w:fldChar w:fldCharType="end"/>
@@ -1826,73 +1741,64 @@
     </w:p>
     <w:p>
       <w:pPr>
-        <w:pStyle w:val="TOC1"/>
+        <w:pStyle w:val="TDC1"/>
         <w:tabs>
           <w:tab w:val="right" w:leader="dot" w:pos="10370"/>
         </w:tabs>
         <w:rPr>
           <w:rFonts w:asciiTheme="minorHAnsi" w:eastAsiaTheme="minorEastAsia" w:hAnsiTheme="minorHAnsi" w:cstheme="minorBidi"/>
-          <w:noProof/>
           <w:color w:val="auto"/>
           <w:kern w:val="2"/>
           <w:sz w:val="24"/>
           <w:szCs w:val="24"/>
-          <w:lang w:val="en-US"/>
+          <w:lang w:eastAsia="es-CL"/>
           <w14:ligatures w14:val="standardContextual"/>
         </w:rPr>
       </w:pPr>
-      <w:hyperlink w:anchor="_Toc241516785" w:history="1">
-        <w:r>
-          <w:rPr>
-            <w:rStyle w:val="Hyperlink"/>
-            <w:noProof/>
+      <w:hyperlink w:anchor="_Toc241593826" w:history="1">
+        <w:r>
+          <w:rPr>
+            <w:rStyle w:val="Hipervnculo"/>
           </w:rPr>
           <w:t>10. Conclusiones del avance</w:t>
         </w:r>
         <w:r>
           <w:rPr>
-            <w:noProof/>
             <w:webHidden/>
           </w:rPr>
           <w:tab/>
         </w:r>
         <w:r>
           <w:rPr>
-            <w:noProof/>
             <w:webHidden/>
           </w:rPr>
           <w:fldChar w:fldCharType="begin"/>
         </w:r>
         <w:r>
           <w:rPr>
-            <w:noProof/>
-            <w:webHidden/>
-          </w:rPr>
-          <w:instrText xml:space="preserve"> PAGEREF _Toc241516785 \h </w:instrText>
-        </w:r>
-        <w:r>
-          <w:rPr>
-            <w:noProof/>
-            <w:webHidden/>
-          </w:rPr>
-        </w:r>
-        <w:r>
-          <w:rPr>
-            <w:noProof/>
+            <w:webHidden/>
+          </w:rPr>
+          <w:instrText xml:space="preserve"> PAGEREF _Toc241593826 \h </w:instrText>
+        </w:r>
+        <w:r>
+          <w:rPr>
+            <w:webHidden/>
+          </w:rPr>
+        </w:r>
+        <w:r>
+          <w:rPr>
             <w:webHidden/>
           </w:rPr>
           <w:fldChar w:fldCharType="separate"/>
         </w:r>
         <w:r>
           <w:rPr>
-            <w:noProof/>
             <w:webHidden/>
           </w:rPr>
           <w:t>5</w:t>
         </w:r>
         <w:r>
           <w:rPr>
-            <w:noProof/>
             <w:webHidden/>
           </w:rPr>
           <w:fldChar w:fldCharType="end"/>
@@ -1901,73 +1807,64 @@
     </w:p>
     <w:p>
       <w:pPr>
-        <w:pStyle w:val="TOC1"/>
+        <w:pStyle w:val="TDC1"/>
         <w:tabs>
           <w:tab w:val="right" w:leader="dot" w:pos="10370"/>
         </w:tabs>
         <w:rPr>
           <w:rFonts w:asciiTheme="minorHAnsi" w:eastAsiaTheme="minorEastAsia" w:hAnsiTheme="minorHAnsi" w:cstheme="minorBidi"/>
-          <w:noProof/>
           <w:color w:val="auto"/>
           <w:kern w:val="2"/>
           <w:sz w:val="24"/>
           <w:szCs w:val="24"/>
-          <w:lang w:val="en-US"/>
+          <w:lang w:eastAsia="es-CL"/>
           <w14:ligatures w14:val="standardContextual"/>
         </w:rPr>
       </w:pPr>
-      <w:hyperlink w:anchor="_Toc241516786" w:history="1">
-        <w:r>
-          <w:rPr>
-            <w:rStyle w:val="Hyperlink"/>
-            <w:noProof/>
+      <w:hyperlink w:anchor="_Toc241593827" w:history="1">
+        <w:r>
+          <w:rPr>
+            <w:rStyle w:val="Hipervnculo"/>
           </w:rPr>
           <w:t>Referencias</w:t>
         </w:r>
         <w:r>
           <w:rPr>
-            <w:noProof/>
             <w:webHidden/>
           </w:rPr>
           <w:tab/>
         </w:r>
         <w:r>
           <w:rPr>
-            <w:noProof/>
             <w:webHidden/>
           </w:rPr>
           <w:fldChar w:fldCharType="begin"/>
         </w:r>
         <w:r>
           <w:rPr>
-            <w:noProof/>
-            <w:webHidden/>
-          </w:rPr>
-          <w:instrText xml:space="preserve"> PAGEREF _Toc241516786 \h </w:instrText>
-        </w:r>
-        <w:r>
-          <w:rPr>
-            <w:noProof/>
-            <w:webHidden/>
-          </w:rPr>
-        </w:r>
-        <w:r>
-          <w:rPr>
-            <w:noProof/>
+            <w:webHidden/>
+          </w:rPr>
+          <w:instrText xml:space="preserve"> PAGEREF _Toc241593827 \h </w:instrText>
+        </w:r>
+        <w:r>
+          <w:rPr>
+            <w:webHidden/>
+          </w:rPr>
+        </w:r>
+        <w:r>
+          <w:rPr>
             <w:webHidden/>
           </w:rPr>
           <w:fldChar w:fldCharType="separate"/>
         </w:r>
         <w:r>
           <w:rPr>
-            <w:noProof/>
             <w:webHidden/>
           </w:rPr>
           <w:t>6</w:t>
         </w:r>
         <w:r>
           <w:rPr>
-            <w:noProof/>
             <w:webHidden/>
           </w:rPr>
           <w:fldChar w:fldCharType="end"/>
@@ -1987,12 +1884,17 @@
     <w:p>
       <w:pPr>
         <w:pStyle w:val="Heading11"/>
-      </w:pPr>
-      <w:bookmarkStart w:id="0" w:name="_Toc241516776"/>
+        <w:rPr>
+          <w:lang w:val="es-CL"/>
+        </w:rPr>
+      </w:pPr>
+      <w:bookmarkStart w:id="0" w:name="_Toc241593817"/>
       <w:r>
         <w:rPr>
           <w:b w:val="0"/>
-        </w:rPr>
+          <w:lang w:val="es-CL"/>
+        </w:rPr>
+        <w:lastRenderedPageBreak/>
         <w:t>1. Introducción y alcance del avance</w:t>
       </w:r>
       <w:bookmarkEnd w:id="0"/>
@@ -2010,11 +1912,15 @@
     <w:p>
       <w:pPr>
         <w:pStyle w:val="Heading11"/>
-      </w:pPr>
-      <w:bookmarkStart w:id="1" w:name="_Toc241516777"/>
+        <w:rPr>
+          <w:lang w:val="es-CL"/>
+        </w:rPr>
+      </w:pPr>
+      <w:bookmarkStart w:id="1" w:name="_Toc241593818"/>
       <w:r>
         <w:rPr>
           <w:b w:val="0"/>
+          <w:lang w:val="es-CL"/>
         </w:rPr>
         <w:t>2. Codificación funcional y arquitectura básica</w:t>
       </w:r>
@@ -2022,216 +1928,280 @@
     </w:p>
     <w:p>
       <w:r>
-        <w:t xml:space="preserve">El archivo </w:t>
+        <w:t>El archivo F3/src/f3_algoritmos.py contiene funciones de lectura, cálculo y medición. cargar_preparado verifica la salida de F2; proporcion_bucle y proporcion_groupby calculan el mismo indicador regional; medir_tiempos y medir_memoria_pico observan costos; leer_original permite comparar lecturas del CSV. La clase AnalizadorNacimientos, propuesta por Jorge Altamirano, reúne la carga del conjunto preparado y los dos cálculos regionales, reutilizando esas funciones.</w:t>
+      </w:r>
+    </w:p>
+    <w:p>
+      <w:r>
+        <w:t xml:space="preserve">El notebook </w:t>
       </w:r>
       <w:r>
         <w:rPr>
           <w:i/>
         </w:rPr>
-        <w:t>F3/src/f3_algoritmos.py</w:t>
-      </w:r>
-      <w:r>
-        <w:t xml:space="preserve"> contiene cinco funciones con responsabilidades independientes. </w:t>
+        <w:t>F3/F3_Avance_Semana2.ipynb</w:t>
+      </w:r>
+      <w:r>
+        <w:t xml:space="preserve"> coordina las funciones, muestra resultados intermedios y comprueba las invariantes. Esta separación evita ocultar la lógica en una única celda y permite reemplazar una implementación sin alterar las demás. Las funciones del módulo devuelven valores o generan errores claros, en lugar de modificar los archivos fuente.</w:t>
+      </w:r>
+    </w:p>
+    <w:p>
+      <w:pPr>
+        <w:pStyle w:val="Heading11"/>
+        <w:rPr>
+          <w:lang w:val="es-CL"/>
+        </w:rPr>
+      </w:pPr>
+      <w:bookmarkStart w:id="2" w:name="_Toc241593819"/>
+      <w:r>
+        <w:rPr>
+          <w:b w:val="0"/>
+          <w:lang w:val="es-CL"/>
+        </w:rPr>
+        <w:t xml:space="preserve">3. Preprocesamiento y transformación del </w:t>
+      </w:r>
+      <w:proofErr w:type="spellStart"/>
+      <w:r>
+        <w:rPr>
+          <w:b w:val="0"/>
+          <w:lang w:val="es-CL"/>
+        </w:rPr>
+        <w:t>dataset</w:t>
+      </w:r>
+      <w:bookmarkEnd w:id="2"/>
+      <w:proofErr w:type="spellEnd"/>
+    </w:p>
+    <w:p>
+      <w:r>
+        <w:t xml:space="preserve">La entrada analítica es </w:t>
       </w:r>
       <w:r>
         <w:rPr>
           <w:i/>
         </w:rPr>
-        <w:t>cargar_preparado</w:t>
-      </w:r>
-      <w:r>
-        <w:t xml:space="preserve"> recibe la ruta de la salida de F2 y verifica que existan las dos columnas del indicador. </w:t>
-      </w:r>
+        <w:t>data/</w:t>
+      </w:r>
+      <w:proofErr w:type="spellStart"/>
       <w:r>
         <w:rPr>
           <w:i/>
         </w:rPr>
-        <w:t>proporcion_bucle</w:t>
-      </w:r>
-      <w:r>
-        <w:t xml:space="preserve"> cuenta nacimientos por región mediante un diccionario; </w:t>
-      </w:r>
+        <w:t>processed</w:t>
+      </w:r>
+      <w:proofErr w:type="spellEnd"/>
       <w:r>
         <w:rPr>
           <w:i/>
         </w:rPr>
-        <w:t>proporcion_groupby</w:t>
-      </w:r>
-      <w:r>
-        <w:t xml:space="preserve"> calcula los mismos conteos con pandas. </w:t>
+        <w:t>/nacimientos_preparados_propuesta.csv</w:t>
+      </w:r>
+      <w:r>
+        <w:t xml:space="preserve">, generada en F2. Se seleccionan </w:t>
       </w:r>
       <w:r>
         <w:rPr>
           <w:i/>
         </w:rPr>
-        <w:t>medir_tiempos</w:t>
-      </w:r>
-      <w:r>
-        <w:t xml:space="preserve"> recibe una operación sin argumentos y devuelve las duraciones de sus repeticiones. </w:t>
+        <w:t>REGION_RESIDENCIA</w:t>
+      </w:r>
+      <w:r>
+        <w:t xml:space="preserve"> y </w:t>
       </w:r>
       <w:r>
         <w:rPr>
           <w:i/>
         </w:rPr>
-        <w:t>leer_original</w:t>
-      </w:r>
-      <w:r>
-        <w:t xml:space="preserve"> permite comparar la lectura del CSV completo con la lectura de seis columnas.</w:t>
-      </w:r>
-    </w:p>
-    <w:p>
-      <w:r>
-        <w:t xml:space="preserve">El notebook </w:t>
-      </w:r>
+        <w:t>madre_menor_20</w:t>
+      </w:r>
+      <w:r>
+        <w:t xml:space="preserve"> porque bastan para el indicador. En F2 ya se había recodificado la edad materna para marcar el grupo menor de 20 años, construido un período mensual a partir de año y mes, documentado la validez técnica de talla y comparado cuatro escenarios de imputación. Este avance no vuelve a estimar esos valores.</w:t>
+      </w:r>
+    </w:p>
+    <w:p>
+      <w:r>
+        <w:t xml:space="preserve">La región es nominal: sus códigos enteros no expresan orden ni distancia. Para la demostración de codificación se divide el conjunto en entrenamiento y prueba con semilla 42 y proporción 80/20. </w:t>
+      </w:r>
+      <w:proofErr w:type="spellStart"/>
       <w:r>
         <w:rPr>
           <w:i/>
         </w:rPr>
-        <w:t>F3/F3_Avance_Semana2.ipynb</w:t>
-      </w:r>
-      <w:r>
-        <w:t xml:space="preserve"> coordina las funciones, muestra resultados intermedios y comprueba las invariantes. Esta separación evita ocultar la lógica en una única celda y permite reemplazar una implementación sin alterar las demás. Las funciones del módulo devuelven valores o generan errores claros, en lugar de modificar los archivos fuente.</w:t>
+        <w:t>OneHotEncoder</w:t>
+      </w:r>
+      <w:proofErr w:type="spellEnd"/>
+      <w:r>
+        <w:t xml:space="preserve"> aprende las 16 categorías observadas solo en entrenamiento y aplica las mismas 16 columnas a prueba. El notebook muestra una tabla de cuatro ejemplos reales: cada región activa una sola columna indicadora. Una categoría hipotética no observada conserva el esquema y recibe ceros; esa fila no puede invertirse únicamente desde la matriz, por lo que se conserva el conjunto con la región original y la correspondencia de filas. La documentación oficial describe este comportamiento de </w:t>
+      </w:r>
+      <w:proofErr w:type="spellStart"/>
+      <w:r>
+        <w:rPr>
+          <w:i/>
+        </w:rPr>
+        <w:t>handle_unknown</w:t>
+      </w:r>
+      <w:proofErr w:type="spellEnd"/>
+      <w:r>
+        <w:rPr>
+          <w:i/>
+        </w:rPr>
+        <w:t>='ignore'</w:t>
+      </w:r>
+      <w:r>
+        <w:t xml:space="preserve"> (</w:t>
+      </w:r>
+      <w:proofErr w:type="spellStart"/>
+      <w:r>
+        <w:t>scikit-learn</w:t>
+      </w:r>
+      <w:proofErr w:type="spellEnd"/>
+      <w:r>
+        <w:t xml:space="preserve"> </w:t>
+      </w:r>
+      <w:proofErr w:type="spellStart"/>
+      <w:r>
+        <w:t>developers</w:t>
+      </w:r>
+      <w:proofErr w:type="spellEnd"/>
+      <w:r>
+        <w:t>, s. f.; Pedregosa et al., 2011).</w:t>
+      </w:r>
+    </w:p>
+    <w:p>
+      <w:r>
+        <w:t>La talla permanece en centímetros. Este prototipo no usa métodos basados en distancias y, por tanto, no necesita escalarla. La matriz codificada es un objeto separado de la versión legible utilizada para tablas y gráficos.</w:t>
       </w:r>
     </w:p>
     <w:p>
       <w:pPr>
         <w:pStyle w:val="Heading11"/>
-      </w:pPr>
-      <w:bookmarkStart w:id="2" w:name="_Toc241516778"/>
+        <w:rPr>
+          <w:lang w:val="es-CL"/>
+        </w:rPr>
+      </w:pPr>
+      <w:bookmarkStart w:id="3" w:name="_Toc241593820"/>
       <w:r>
         <w:rPr>
           <w:b w:val="0"/>
-        </w:rPr>
-        <w:t>3. Preprocesamiento y transformación del dataset</w:t>
-      </w:r>
-      <w:bookmarkEnd w:id="2"/>
-    </w:p>
-    <w:p>
-      <w:r>
-        <w:t xml:space="preserve">La entrada analítica es </w:t>
-      </w:r>
+          <w:lang w:val="es-CL"/>
+        </w:rPr>
+        <w:lastRenderedPageBreak/>
+        <w:t>4. Validación técnica y verificación</w:t>
+      </w:r>
+      <w:bookmarkEnd w:id="3"/>
+    </w:p>
+    <w:p>
+      <w:r>
+        <w:t xml:space="preserve">La ejecución completa comprueba que las columnas requeridas no tienen nulos y que los códigos regionales están entre 1 y 16. Las versiones con bucle y </w:t>
+      </w:r>
+      <w:proofErr w:type="spellStart"/>
       <w:r>
         <w:rPr>
           <w:i/>
         </w:rPr>
-        <w:t>data/processed/nacimientos_preparados_propuesta.csv</w:t>
-      </w:r>
-      <w:r>
-        <w:t xml:space="preserve">, generada en F2. Se seleccionan </w:t>
+        <w:t>groupby</w:t>
+      </w:r>
+      <w:proofErr w:type="spellEnd"/>
+      <w:r>
+        <w:t xml:space="preserve"> entregaron los mismos conteos y porcentajes por región; la suma de nacimientos regionales coincide con las 735.611 filas y la suma de las marcas maternas coincide con el total de la columna original.</w:t>
+      </w:r>
+    </w:p>
+    <w:p>
+      <w:r>
+        <w:t xml:space="preserve">En la comparación de lectura se constató igualdad fila por fila de las seis columnas pertinentes. Para la codificación se verificaron igual número y nombre de columnas en entrenamiento y prueba, una única categoría activa por fila conocida y ausencia de columna nueva ante la categoría hipotética 99. La función recursiva </w:t>
       </w:r>
       <w:r>
         <w:rPr>
           <w:i/>
         </w:rPr>
-        <w:t>REGION_RESIDENCIA</w:t>
-      </w:r>
-      <w:r>
-        <w:t xml:space="preserve"> y </w:t>
-      </w:r>
+        <w:t>aplanar</w:t>
+      </w:r>
+      <w:r>
+        <w:t xml:space="preserve"> de F2 también se comprobó con metadatos anidados de dos niveles. Estas verificaciones corresponden a evidencia básica, no a una batería exhaustiva de pruebas.</w:t>
+      </w:r>
+    </w:p>
+    <w:p>
+      <w:pPr>
+        <w:pStyle w:val="Heading11"/>
+        <w:rPr>
+          <w:lang w:val="es-CL"/>
+        </w:rPr>
+      </w:pPr>
+      <w:bookmarkStart w:id="4" w:name="_Toc241593821"/>
+      <w:r>
+        <w:rPr>
+          <w:b w:val="0"/>
+          <w:lang w:val="es-CL"/>
+        </w:rPr>
+        <w:t>5. Eficiencia y optimización</w:t>
+      </w:r>
+      <w:bookmarkEnd w:id="4"/>
+    </w:p>
+    <w:p>
+      <w:r>
+        <w:t xml:space="preserve">Se usó </w:t>
+      </w:r>
+      <w:proofErr w:type="spellStart"/>
+      <w:proofErr w:type="gramStart"/>
       <w:r>
         <w:rPr>
           <w:i/>
         </w:rPr>
-        <w:t>madre_menor_20</w:t>
-      </w:r>
-      <w:r>
-        <w:t xml:space="preserve"> porque bastan para el indicador. En F2 ya se había recodificado la edad materna para marcar el grupo menor de 20 años, construido un período mensual a partir de año y mes, documentado la validez técnica de talla y comparado cuatro escenarios de imputación. Este avance no vuelve a estimar esos valores.</w:t>
-      </w:r>
-    </w:p>
-    <w:p>
-      <w:r>
-        <w:t xml:space="preserve">La región es nominal: sus códigos enteros no expresan orden ni distancia. Para la demostración de codificación se divide el conjunto en entrenamiento y prueba con semilla 42 y proporción 80/20. </w:t>
-      </w:r>
+        <w:t>time.perf</w:t>
+      </w:r>
+      <w:proofErr w:type="gramEnd"/>
       <w:r>
         <w:rPr>
           <w:i/>
         </w:rPr>
-        <w:t>OneHotEncoder</w:t>
-      </w:r>
-      <w:r>
-        <w:t xml:space="preserve"> aprende las 16 categorías observadas solo en entrenamiento y aplica las mismas 16 columnas a prueba. El notebook muestra una tabla de cuatro ejemplos reales: cada región activa una sola columna indicadora. Una categoría hipotética no observada conserva el esquema y recibe ceros; esa fila no puede invertirse únicamente desde la matriz, por lo que se conserva el conjunto con la región original y la correspondencia de filas. La documentación oficial describe este comportamiento de </w:t>
-      </w:r>
+        <w:t>_</w:t>
+      </w:r>
+      <w:proofErr w:type="gramStart"/>
       <w:r>
         <w:rPr>
           <w:i/>
         </w:rPr>
-        <w:t>handle_unknown='ignore'</w:t>
-      </w:r>
-      <w:r>
-        <w:t xml:space="preserve"> (scikit-learn developers, s. f.; Pedregosa et al., 2011).</w:t>
-      </w:r>
-    </w:p>
-    <w:p>
-      <w:r>
-        <w:t>La talla permanece en centímetros. Este prototipo no usa métodos basados en distancias y, por tanto, no necesita escalarla. La matriz codificada es un objeto separado de la versión legible utilizada para tablas y gráficos.</w:t>
-      </w:r>
-    </w:p>
-    <w:p>
-      <w:pPr>
-        <w:pStyle w:val="Heading11"/>
-      </w:pPr>
-      <w:bookmarkStart w:id="3" w:name="_Toc241516779"/>
-      <w:r>
-        <w:rPr>
-          <w:b w:val="0"/>
-        </w:rPr>
-        <w:t>4. Validación técnica y verificación</w:t>
-      </w:r>
-      <w:bookmarkEnd w:id="3"/>
-    </w:p>
-    <w:p>
-      <w:r>
-        <w:t xml:space="preserve">La ejecución completa comprueba que las columnas requeridas no tienen nulos y que los códigos regionales están entre 1 y 16. Las versiones con bucle y </w:t>
-      </w:r>
+        <w:t>counter</w:t>
+      </w:r>
+      <w:proofErr w:type="spellEnd"/>
       <w:r>
         <w:rPr>
           <w:i/>
         </w:rPr>
-        <w:t>groupby</w:t>
-      </w:r>
-      <w:r>
-        <w:t xml:space="preserve"> entregaron los mismos conteos y porcentajes por región; la suma de nacimientos regionales coincide con las 735.611 filas y la suma de las marcas maternas coincide con el total de la columna original.</w:t>
-      </w:r>
-    </w:p>
-    <w:p>
-      <w:r>
-        <w:t xml:space="preserve">En la comparación de lectura se constató igualdad fila por fila de las seis columnas pertinentes. Para la codificación se verificaron igual número y nombre de columnas en entrenamiento y prueba, una única categoría activa por fila conocida y ausencia de columna nueva ante la categoría hipotética 99. La función recursiva </w:t>
-      </w:r>
+        <w:t>(</w:t>
+      </w:r>
+      <w:proofErr w:type="gramEnd"/>
       <w:r>
         <w:rPr>
           <w:i/>
         </w:rPr>
-        <w:t>aplanar</w:t>
-      </w:r>
-      <w:r>
-        <w:t xml:space="preserve"> de F2 también se comprobó con metadatos anidados de dos niveles. Estas verificaciones corresponden a evidencia básica, no a una batería exhaustiva de pruebas.</w:t>
-      </w:r>
-    </w:p>
-    <w:p>
-      <w:pPr>
-        <w:pStyle w:val="Heading11"/>
-      </w:pPr>
-      <w:bookmarkStart w:id="4" w:name="_Toc241516780"/>
-      <w:r>
-        <w:rPr>
-          <w:b w:val="0"/>
-        </w:rPr>
-        <w:t>5. Eficiencia y optimización</w:t>
-      </w:r>
-      <w:bookmarkEnd w:id="4"/>
-    </w:p>
-    <w:p>
-      <w:r>
-        <w:t xml:space="preserve">Se usó </w:t>
-      </w:r>
-      <w:r>
-        <w:rPr>
-          <w:i/>
-        </w:rPr>
-        <w:t>time.perf_counter()</w:t>
-      </w:r>
-      <w:r>
-        <w:t xml:space="preserve"> y se conservó el menor tiempo de tres repeticiones con el conjunto completo, conforme a la guía docente (Salinas Silva, 2026; Python Software Foundation, s. f.). Los tiempos describen esta ejecución en Python 3.13.5, pandas 3.0.5, NumPy 2.5.2 y scikit-learn 1.9.0; pueden variar en otro equipo.</w:t>
+        <w:t>)</w:t>
+      </w:r>
+      <w:r>
+        <w:t xml:space="preserve"> y se conservó el menor tiempo de tres repeticiones con el conjunto completo, conforme a la guía docente (Salinas Silva, 2026; Python Software </w:t>
+      </w:r>
+      <w:proofErr w:type="spellStart"/>
+      <w:r>
+        <w:t>Foundation</w:t>
+      </w:r>
+      <w:proofErr w:type="spellEnd"/>
+      <w:r>
+        <w:t xml:space="preserve">, s. f.). Los tiempos describen esta ejecución en Python 3.13.5, pandas 3.0.5, </w:t>
+      </w:r>
+      <w:proofErr w:type="spellStart"/>
+      <w:r>
+        <w:t>NumPy</w:t>
+      </w:r>
+      <w:proofErr w:type="spellEnd"/>
+      <w:r>
+        <w:t xml:space="preserve"> 2.5.2 y </w:t>
+      </w:r>
+      <w:proofErr w:type="spellStart"/>
+      <w:r>
+        <w:t>scikit-learn</w:t>
+      </w:r>
+      <w:proofErr w:type="spellEnd"/>
+      <w:r>
+        <w:t xml:space="preserve"> 1.9.0; pueden variar en otro equipo.</w:t>
       </w:r>
     </w:p>
     <w:tbl>
@@ -2363,7 +2333,7 @@
           </w:tcPr>
           <w:p>
             <w:r>
-              <w:t>Bucle: 0.1440 s</w:t>
+              <w:t>Bucle: 0.1423 s</w:t>
             </w:r>
           </w:p>
         </w:tc>
@@ -2374,9 +2344,12 @@
             <w:vAlign w:val="center"/>
           </w:tcPr>
           <w:p>
+            <w:proofErr w:type="spellStart"/>
             <w:r>
-              <w:t>groupby: 0.0101 s</w:t>
+              <w:t>groupby: 0.0090 s</w:t>
             </w:r>
+            <w:proofErr w:type="spellEnd"/>
+            <w:r/>
           </w:p>
         </w:tc>
         <w:tc>
@@ -2425,7 +2398,7 @@
           </w:tcPr>
           <w:p>
             <w:r>
-              <w:t>25 columnas: 0.9796 s</w:t>
+              <w:t>25 columnas: 0.9710 s</w:t>
             </w:r>
           </w:p>
         </w:tc>
@@ -2437,7 +2410,7 @@
           </w:tcPr>
           <w:p>
             <w:r>
-              <w:t>6 columnas: 0.5712 s</w:t>
+              <w:t>6 columnas: 0.5450 s</w:t>
             </w:r>
           </w:p>
         </w:tc>
@@ -2475,8 +2448,16 @@
               <w:rPr>
                 <w:sz w:val="18"/>
               </w:rPr>
-              <w:t>Memoria del DataFrame</w:t>
+              <w:t xml:space="preserve">Memoria del </w:t>
             </w:r>
+            <w:proofErr w:type="spellStart"/>
+            <w:r>
+              <w:rPr>
+                <w:sz w:val="18"/>
+              </w:rPr>
+              <w:t>DataFrame</w:t>
+            </w:r>
+            <w:proofErr w:type="spellEnd"/>
           </w:p>
         </w:tc>
         <w:tc>
@@ -2528,51 +2509,95 @@
       <w:r>
         <w:t xml:space="preserve">En esta medición, </w:t>
       </w:r>
+      <w:proofErr w:type="spellStart"/>
       <w:r>
         <w:rPr>
           <w:i/>
         </w:rPr>
         <w:t>groupby</w:t>
       </w:r>
-      <w:r>
-        <w:t xml:space="preserve"> fue 14.25 veces más rápido que el bucle. La lectura selectiva fue 1.71 veces más rápida y el DataFrame resultante ocupó 3.21 veces menos memoria. Se adopta </w:t>
-      </w:r>
+      <w:proofErr w:type="spellEnd"/>
+      <w:r>
+        <w:t xml:space="preserve"> fue 15.86 veces más rápido que el bucle. La lectura selectiva fue 1.78 veces más rápida y el </w:t>
+      </w:r>
+      <w:proofErr w:type="spellStart"/>
+      <w:r>
+        <w:t>DataFrame</w:t>
+      </w:r>
+      <w:proofErr w:type="spellEnd"/>
+      <w:r>
+        <w:t xml:space="preserve"> resultante ocupó 3.21 veces menos memoria. Se adopta </w:t>
+      </w:r>
+      <w:proofErr w:type="spellStart"/>
       <w:r>
         <w:rPr>
           <w:i/>
         </w:rPr>
         <w:t>groupby</w:t>
       </w:r>
+      <w:proofErr w:type="spellEnd"/>
       <w:r>
         <w:t xml:space="preserve"> para el indicador y </w:t>
       </w:r>
+      <w:proofErr w:type="spellStart"/>
       <w:r>
         <w:rPr>
           <w:i/>
         </w:rPr>
         <w:t>usecols</w:t>
       </w:r>
+      <w:proofErr w:type="spellEnd"/>
       <w:r>
         <w:t xml:space="preserve"> para lecturas que solo necesiten las seis variables. El parámetro </w:t>
       </w:r>
+      <w:proofErr w:type="spellStart"/>
       <w:r>
         <w:rPr>
           <w:i/>
         </w:rPr>
         <w:t>usecols</w:t>
       </w:r>
-      <w:r>
-        <w:t xml:space="preserve"> evita materializar columnas no usadas, según la documentación de pandas (The pandas development team, s. f.). La memoria informada es la ocupación profunda del DataFrame; no representa el pico total del proceso.</w:t>
+      <w:proofErr w:type="spellEnd"/>
+      <w:r>
+        <w:t xml:space="preserve"> evita materializar columnas no usadas, según la documentación de pandas (The pandas </w:t>
+      </w:r>
+      <w:proofErr w:type="spellStart"/>
+      <w:r>
+        <w:t>development</w:t>
+      </w:r>
+      <w:proofErr w:type="spellEnd"/>
+      <w:r>
+        <w:t xml:space="preserve"> </w:t>
+      </w:r>
+      <w:proofErr w:type="spellStart"/>
+      <w:r>
+        <w:t>team</w:t>
+      </w:r>
+      <w:proofErr w:type="spellEnd"/>
+      <w:r>
+        <w:t xml:space="preserve">, s. f.). La memoria informada es la ocupación profunda del </w:t>
+      </w:r>
+      <w:proofErr w:type="spellStart"/>
+      <w:r>
+        <w:t>DataFrame</w:t>
+      </w:r>
+      <w:proofErr w:type="spellEnd"/>
+      <w:r>
+        <w:t>; no representa el pico total del proceso.</w:t>
       </w:r>
     </w:p>
     <w:p>
       <w:pPr>
         <w:pStyle w:val="Heading11"/>
-      </w:pPr>
-      <w:bookmarkStart w:id="5" w:name="_Toc241516781"/>
+        <w:rPr>
+          <w:lang w:val="es-CL"/>
+        </w:rPr>
+      </w:pPr>
+      <w:bookmarkStart w:id="5" w:name="_Toc241593822"/>
       <w:r>
         <w:rPr>
           <w:b w:val="0"/>
+          <w:lang w:val="es-CL"/>
         </w:rPr>
         <w:t>6. Diseño estructurado y modularidad</w:t>
       </w:r>
@@ -2591,11 +2616,19 @@
       <w:r>
         <w:t xml:space="preserve"> desde </w:t>
       </w:r>
+      <w:proofErr w:type="spellStart"/>
       <w:r>
         <w:rPr>
           <w:i/>
         </w:rPr>
-        <w:t>src/f2_utilidades.py</w:t>
+        <w:t>src</w:t>
+      </w:r>
+      <w:proofErr w:type="spellEnd"/>
+      <w:r>
+        <w:rPr>
+          <w:i/>
+        </w:rPr>
+        <w:t>/f2_utilidades.py</w:t>
       </w:r>
       <w:r>
         <w:t>: se aplicó a los metadatos reales de esta ejecución, que incluyen versiones, tiempos y parámetros de codificación. Su caso recursivo desciende en diccionarios anidados y su caso base registra un valor simple. No se emplea recursión sobre las filas de nacimientos, donde un recorrido o una agrupación son más adecuados. Esta distinción responde al criterio de pertinencia explicado en la guía docente (Salinas Silva, 2026).</w:t>
@@ -2604,11 +2637,15 @@
     <w:p>
       <w:pPr>
         <w:pStyle w:val="Heading11"/>
-      </w:pPr>
-      <w:bookmarkStart w:id="6" w:name="_Toc241516782"/>
+        <w:rPr>
+          <w:lang w:val="es-CL"/>
+        </w:rPr>
+      </w:pPr>
+      <w:bookmarkStart w:id="6" w:name="_Toc241593823"/>
       <w:r>
         <w:rPr>
           <w:b w:val="0"/>
+          <w:lang w:val="es-CL"/>
         </w:rPr>
         <w:t>7. Implementación modular y programación orientada a objetos</w:t>
       </w:r>
@@ -2616,36 +2653,23 @@
     </w:p>
     <w:p>
       <w:r>
-        <w:t xml:space="preserve">No se incorpora una clase vacía para cumplir nominalmente el apartado de programación orientada a objetos: la Formativa 3 acepta funciones bien delimitadas. En una fase posterior, el codificador sí puede encapsular estado aprendido en entrenamiento mediante operaciones </w:t>
-      </w:r>
-      <w:r>
-        <w:rPr>
-          <w:i/>
-        </w:rPr>
-        <w:t>fit</w:t>
-      </w:r>
-      <w:r>
-        <w:t xml:space="preserve"> y </w:t>
-      </w:r>
-      <w:r>
-        <w:rPr>
-          <w:i/>
-        </w:rPr>
-        <w:t>transform</w:t>
-      </w:r>
-      <w:r>
-        <w:t>; lectura, indicadores, validación y visualización seguirían en componentes separados.</w:t>
+        <w:t>Se incorporó AnalizadorNacimientos para organizar la lectura del conjunto preparado y las dos formas de calcular el indicador regional. Sus métodos exigen que los datos se carguen antes de calcular. El notebook comprueba que el bucle y groupby producen los mismos resultados y mide el tiempo de cada alternativa. La clase organiza el uso de esos cálculos; por sí sola no demuestra una mejora de velocidad. Las funciones independientes permanecen disponibles para mediciones sobre distintos tamaños de entrada.</w:t>
       </w:r>
     </w:p>
     <w:p>
       <w:pPr>
         <w:pStyle w:val="Heading11"/>
-      </w:pPr>
-      <w:bookmarkStart w:id="7" w:name="_Toc241516783"/>
+        <w:rPr>
+          <w:lang w:val="es-CL"/>
+        </w:rPr>
+      </w:pPr>
+      <w:bookmarkStart w:id="7" w:name="_Toc241593824"/>
       <w:r>
         <w:rPr>
           <w:b w:val="0"/>
-        </w:rPr>
+          <w:lang w:val="es-CL"/>
+        </w:rPr>
+        <w:lastRenderedPageBreak/>
         <w:t>8. Documentación de arquitectura y repositorio</w:t>
       </w:r>
       <w:bookmarkEnd w:id="7"/>
@@ -2725,7 +2749,21 @@
               <w:rPr>
                 <w:sz w:val="18"/>
               </w:rPr>
-              <w:t>data/processed/</w:t>
+              <w:t>data/</w:t>
+            </w:r>
+            <w:proofErr w:type="spellStart"/>
+            <w:r>
+              <w:rPr>
+                <w:sz w:val="18"/>
+              </w:rPr>
+              <w:t>processed</w:t>
+            </w:r>
+            <w:proofErr w:type="spellEnd"/>
+            <w:r>
+              <w:rPr>
+                <w:sz w:val="18"/>
+              </w:rPr>
+              <w:t>/</w:t>
             </w:r>
           </w:p>
         </w:tc>
@@ -2819,7 +2857,7 @@
               <w:rPr>
                 <w:sz w:val="18"/>
               </w:rPr>
-              <w:t>Lectura, dos cálculos equivalentes y medición.</w:t>
+              <w:t>Lectura, clase regional, dos cálculos equivalentes y mediciones.</w:t>
             </w:r>
           </w:p>
         </w:tc>
@@ -2942,23 +2980,61 @@
     <w:p/>
     <w:p>
       <w:r>
-        <w:t>La arquitectura conserva F2 como referencia y añade F3 sin copiar sus CSV. El avance está publicado en una rama del repositorio del grupo para revisión mediante un pull request. Su integración a main queda sujeta a la revisión del equipo.</w:t>
-      </w:r>
+        <w:t xml:space="preserve">La arquitectura conserva F2 como referencia y añade F3 sin copiar sus CSV. El avance está publicado en una rama del repositorio del grupo para revisión mediante un </w:t>
+      </w:r>
+      <w:proofErr w:type="spellStart"/>
       <w:r>
         <w:rPr>
           <w:i/>
-        </w:rPr>
-      </w:r>
-      <w:r/>
+          <w:iCs/>
+        </w:rPr>
+        <w:t>pull</w:t>
+      </w:r>
+      <w:proofErr w:type="spellEnd"/>
+      <w:r>
+        <w:rPr>
+          <w:i/>
+          <w:iCs/>
+        </w:rPr>
+        <w:t xml:space="preserve"> </w:t>
+      </w:r>
+      <w:proofErr w:type="spellStart"/>
+      <w:r>
+        <w:rPr>
+          <w:i/>
+          <w:iCs/>
+        </w:rPr>
+        <w:t>request</w:t>
+      </w:r>
+      <w:proofErr w:type="spellEnd"/>
+      <w:r>
+        <w:t xml:space="preserve">. Su integración a </w:t>
+      </w:r>
+      <w:proofErr w:type="spellStart"/>
+      <w:r>
+        <w:rPr>
+          <w:i/>
+          <w:iCs/>
+        </w:rPr>
+        <w:t>main</w:t>
+      </w:r>
+      <w:proofErr w:type="spellEnd"/>
+      <w:r>
+        <w:t xml:space="preserve"> queda sujeta a la revisión del equipo.</w:t>
+      </w:r>
     </w:p>
     <w:p>
       <w:pPr>
         <w:pStyle w:val="Heading11"/>
-      </w:pPr>
-      <w:bookmarkStart w:id="8" w:name="_Toc241516784"/>
+        <w:rPr>
+          <w:lang w:val="es-CL"/>
+        </w:rPr>
+      </w:pPr>
+      <w:bookmarkStart w:id="8" w:name="_Toc241593825"/>
       <w:r>
         <w:rPr>
           <w:b w:val="0"/>
+          <w:lang w:val="es-CL"/>
         </w:rPr>
         <w:t>9. Notebook ejecutado y reproducibilidad</w:t>
       </w:r>
@@ -2968,28 +3044,50 @@
       <w:r>
         <w:t xml:space="preserve">El cuaderno se ejecutó completo, en orden, con nueve celdas de código y salidas visibles. Registra versiones efectivas y rutas, verifica equivalencia antes de interpretar tiempos, y escribe </w:t>
       </w:r>
+      <w:proofErr w:type="spellStart"/>
+      <w:proofErr w:type="gramStart"/>
       <w:r>
         <w:rPr>
           <w:i/>
         </w:rPr>
         <w:t>mediciones.json</w:t>
       </w:r>
+      <w:proofErr w:type="spellEnd"/>
+      <w:proofErr w:type="gramEnd"/>
       <w:r>
         <w:t xml:space="preserve"> y </w:t>
       </w:r>
+      <w:proofErr w:type="spellStart"/>
       <w:r>
         <w:rPr>
           <w:i/>
         </w:rPr>
-        <w:t>parametros_codificacion.json</w:t>
-      </w:r>
-      <w:r>
-        <w:t xml:space="preserve">. Para reproducirlo se abre la raíz del repositorio, se crea el entorno virtual con requirements.txt, se selecciona ese kernel y se ejecutan todas las celdas tras reiniciar. </w:t>
-      </w:r>
+        <w:t>parametros_</w:t>
+      </w:r>
+      <w:proofErr w:type="gramStart"/>
       <w:r>
         <w:rPr>
           <w:i/>
         </w:rPr>
+        <w:t>codificacion.json</w:t>
+      </w:r>
+      <w:proofErr w:type="spellEnd"/>
+      <w:proofErr w:type="gramEnd"/>
+      <w:r>
+        <w:t xml:space="preserve">. Para reproducirlo se abre la raíz del repositorio, se crea el entorno virtual con requirements.txt, se selecciona ese </w:t>
+      </w:r>
+      <w:proofErr w:type="spellStart"/>
+      <w:r>
+        <w:t>kernel</w:t>
+      </w:r>
+      <w:proofErr w:type="spellEnd"/>
+      <w:r>
+        <w:t xml:space="preserve"> y se ejecutan todas las celdas tras reiniciar. </w:t>
+      </w:r>
+      <w:r>
+        <w:rPr>
+          <w:i/>
+        </w:rPr>
         <w:t>F3/README.md</w:t>
       </w:r>
       <w:r>
@@ -2999,11 +3097,15 @@
     <w:p>
       <w:pPr>
         <w:pStyle w:val="Heading11"/>
-      </w:pPr>
-      <w:bookmarkStart w:id="9" w:name="_Toc241516785"/>
+        <w:rPr>
+          <w:lang w:val="es-CL"/>
+        </w:rPr>
+      </w:pPr>
+      <w:bookmarkStart w:id="9" w:name="_Toc241593826"/>
       <w:r>
         <w:rPr>
           <w:b w:val="0"/>
+          <w:lang w:val="es-CL"/>
         </w:rPr>
         <w:t>10. Conclusiones del avance</w:t>
       </w:r>
@@ -3011,66 +3113,235 @@
     </w:p>
     <w:p>
       <w:r>
-        <w:t>El prototipo produce el mismo indicador con ambas implementaciones y demuestra una ventaja temporal de la agrupación de pandas en el conjunto completo. La lectura selectiva reduce el tiempo y la memoria del objeto cargado sin cambiar las seis variables utilizadas. La codificación nominal mantiene separados entrenamiento y prueba y conserva los datos interpretables para etapas posteriores. El módulo de funciones y las verificaciones visibles establecen una base para ampliar el proyecto sin rehacer F2 ni intr</w:t>
-      </w:r>
-      <w:r>
-        <w:t>oducir clases antes de que exista una responsabilidad con estado que las justifique.</w:t>
+        <w:t>El prototipo produce el mismo indicador con ambas implementaciones y demuestra una ventaja temporal de la agrupación de pandas en el conjunto completo. La lectura selectiva reduce el tiempo y la memoria del objeto cargado sin cambiar las seis variables utilizadas. La codificación nominal mantiene separados entrenamiento y prueba y conserva los datos interpretables para etapas posteriores. El módulo de funciones y las verificaciones visibles establecen una base para ampliar el proyecto sin rehacer F2 y usar una clase para reunir la lectura preparada y los dos cálculos regionales.</w:t>
       </w:r>
     </w:p>
     <w:p>
       <w:pPr>
         <w:pStyle w:val="Heading11"/>
         <w:pageBreakBefore/>
-      </w:pPr>
-      <w:bookmarkStart w:id="10" w:name="_Toc241516786"/>
+        <w:rPr>
+          <w:lang w:val="es-CL"/>
+        </w:rPr>
+      </w:pPr>
+      <w:bookmarkStart w:id="10" w:name="_Toc241593827"/>
       <w:r>
         <w:rPr>
           <w:b w:val="0"/>
-        </w:rPr>
+          <w:lang w:val="es-CL"/>
+        </w:rPr>
+        <w:lastRenderedPageBreak/>
         <w:t>Referencias</w:t>
       </w:r>
       <w:bookmarkEnd w:id="10"/>
     </w:p>
     <w:p>
       <w:pPr>
+        <w:pStyle w:val="Prrafodelista"/>
         <w:keepLines/>
-        <w:ind w:left="397" w:hanging="397"/>
-      </w:pPr>
-      <w:r>
-        <w:t xml:space="preserve">Pedregosa, F., Varoquaux, G., Gramfort, A., Michel, V., Thirion, B., Grisel, O., Blondel, M., Prettenhofer, P., Weiss, R., Dubourg, V., Vanderplas, J., Passos, A., Cournapeau, D., Brucher, M., Perrot, M., y Duchesnay, É. (2011). Scikit-learn: Machine learning in Python. </w:t>
-      </w:r>
+        <w:numPr>
+          <w:ilvl w:val="0"/>
+          <w:numId w:val="7"/>
+        </w:numPr>
+        <w:jc w:val="left"/>
+      </w:pPr>
+      <w:r>
+        <w:t xml:space="preserve">Pedregosa, F., </w:t>
+      </w:r>
+      <w:proofErr w:type="spellStart"/>
+      <w:r>
+        <w:t>Varoquaux</w:t>
+      </w:r>
+      <w:proofErr w:type="spellEnd"/>
+      <w:r>
+        <w:t xml:space="preserve">, G., </w:t>
+      </w:r>
+      <w:proofErr w:type="spellStart"/>
+      <w:r>
+        <w:t>Gramfort</w:t>
+      </w:r>
+      <w:proofErr w:type="spellEnd"/>
+      <w:r>
+        <w:t xml:space="preserve">, A., Michel, V., Thirion, B., Grisel, O., Blondel, M., </w:t>
+      </w:r>
+      <w:proofErr w:type="spellStart"/>
+      <w:r>
+        <w:t>Prettenhofer</w:t>
+      </w:r>
+      <w:proofErr w:type="spellEnd"/>
+      <w:r>
+        <w:t xml:space="preserve">, P., Weiss, R., Dubourg, V., Vanderplas, J., Passos, A., </w:t>
+      </w:r>
+      <w:proofErr w:type="spellStart"/>
+      <w:r>
+        <w:t>Cournapeau</w:t>
+      </w:r>
+      <w:proofErr w:type="spellEnd"/>
+      <w:r>
+        <w:t xml:space="preserve">, D., Brucher, M., Perrot, M., y </w:t>
+      </w:r>
+      <w:proofErr w:type="spellStart"/>
+      <w:r>
+        <w:t>Duchesnay</w:t>
+      </w:r>
+      <w:proofErr w:type="spellEnd"/>
+      <w:r>
+        <w:t>, É. (2011). Scikit-</w:t>
+      </w:r>
+      <w:proofErr w:type="spellStart"/>
+      <w:r>
+        <w:t>learn</w:t>
+      </w:r>
+      <w:proofErr w:type="spellEnd"/>
+      <w:r>
+        <w:t xml:space="preserve">: Machine </w:t>
+      </w:r>
+      <w:proofErr w:type="spellStart"/>
+      <w:r>
+        <w:t>learning</w:t>
+      </w:r>
+      <w:proofErr w:type="spellEnd"/>
+      <w:r>
+        <w:t xml:space="preserve"> in Python. </w:t>
+      </w:r>
+      <w:proofErr w:type="spellStart"/>
       <w:r>
         <w:rPr>
           <w:i/>
         </w:rPr>
-        <w:t>Journal of Machine Learning Research, 12</w:t>
-      </w:r>
-      <w:r>
-        <w:t>, 2825–2830. https://www.jmlr.org/papers/v12/pedregosa11a.html</w:t>
-      </w:r>
-    </w:p>
-    <w:p>
-      <w:pPr>
+        <w:t>Journal</w:t>
+      </w:r>
+      <w:proofErr w:type="spellEnd"/>
+      <w:r>
+        <w:rPr>
+          <w:i/>
+        </w:rPr>
+        <w:t xml:space="preserve"> </w:t>
+      </w:r>
+      <w:proofErr w:type="spellStart"/>
+      <w:r>
+        <w:rPr>
+          <w:i/>
+        </w:rPr>
+        <w:t>of</w:t>
+      </w:r>
+      <w:proofErr w:type="spellEnd"/>
+      <w:r>
+        <w:rPr>
+          <w:i/>
+        </w:rPr>
+        <w:t xml:space="preserve"> Machine </w:t>
+      </w:r>
+      <w:proofErr w:type="spellStart"/>
+      <w:r>
+        <w:rPr>
+          <w:i/>
+        </w:rPr>
+        <w:t>Learning</w:t>
+      </w:r>
+      <w:proofErr w:type="spellEnd"/>
+      <w:r>
+        <w:rPr>
+          <w:i/>
+        </w:rPr>
+        <w:t xml:space="preserve"> </w:t>
+      </w:r>
+      <w:proofErr w:type="spellStart"/>
+      <w:r>
+        <w:rPr>
+          <w:i/>
+        </w:rPr>
+        <w:t>Research</w:t>
+      </w:r>
+      <w:proofErr w:type="spellEnd"/>
+      <w:r>
+        <w:rPr>
+          <w:i/>
+        </w:rPr>
+        <w:t>, 12</w:t>
+      </w:r>
+      <w:r>
+        <w:t xml:space="preserve">, 2825–2830. </w:t>
+      </w:r>
+      <w:hyperlink r:id="rId22" w:history="1">
+        <w:r>
+          <w:rPr>
+            <w:rStyle w:val="Hipervnculo"/>
+          </w:rPr>
+          <w:t>https://www.jmlr.org/papers/v12/pedregosa11a.html</w:t>
+        </w:r>
+      </w:hyperlink>
+    </w:p>
+    <w:p>
+      <w:pPr>
+        <w:pStyle w:val="Prrafodelista"/>
         <w:keepLines/>
-        <w:ind w:left="397" w:hanging="397"/>
-      </w:pPr>
-      <w:r>
-        <w:t xml:space="preserve">Python Software Foundation. (s. f.). </w:t>
+        <w:numPr>
+          <w:ilvl w:val="0"/>
+          <w:numId w:val="7"/>
+        </w:numPr>
+        <w:jc w:val="left"/>
+      </w:pPr>
+      <w:r>
+        <w:t xml:space="preserve">Python Software </w:t>
+      </w:r>
+      <w:proofErr w:type="spellStart"/>
+      <w:r>
+        <w:t>Foundation</w:t>
+      </w:r>
+      <w:proofErr w:type="spellEnd"/>
+      <w:r>
+        <w:t xml:space="preserve">. (s. f.). </w:t>
       </w:r>
       <w:r>
         <w:rPr>
           <w:i/>
         </w:rPr>
-        <w:t>time — Time access and conversions</w:t>
-      </w:r>
-      <w:r>
-        <w:t>. https://docs.python.org/3/library/time.html</w:t>
-      </w:r>
-    </w:p>
-    <w:p>
-      <w:pPr>
+        <w:t xml:space="preserve">time — Time </w:t>
+      </w:r>
+      <w:proofErr w:type="spellStart"/>
+      <w:r>
+        <w:rPr>
+          <w:i/>
+        </w:rPr>
+        <w:t>access</w:t>
+      </w:r>
+      <w:proofErr w:type="spellEnd"/>
+      <w:r>
+        <w:rPr>
+          <w:i/>
+        </w:rPr>
+        <w:t xml:space="preserve"> and </w:t>
+      </w:r>
+      <w:proofErr w:type="spellStart"/>
+      <w:r>
+        <w:rPr>
+          <w:i/>
+        </w:rPr>
+        <w:t>conversions</w:t>
+      </w:r>
+      <w:proofErr w:type="spellEnd"/>
+      <w:r>
+        <w:t xml:space="preserve">. </w:t>
+      </w:r>
+      <w:hyperlink r:id="rId23" w:history="1">
+        <w:r>
+          <w:rPr>
+            <w:rStyle w:val="Hipervnculo"/>
+          </w:rPr>
+          <w:t>https://docs.python.org/3/library/time.html</w:t>
+        </w:r>
+      </w:hyperlink>
+    </w:p>
+    <w:p>
+      <w:pPr>
+        <w:pStyle w:val="Prrafodelista"/>
         <w:keepLines/>
-        <w:ind w:left="397" w:hanging="397"/>
+        <w:numPr>
+          <w:ilvl w:val="0"/>
+          <w:numId w:val="7"/>
+        </w:numPr>
+        <w:jc w:val="left"/>
       </w:pPr>
       <w:r>
         <w:t xml:space="preserve">Salinas Silva, O. (2026). </w:t>
@@ -3087,44 +3358,116 @@
     </w:p>
     <w:p>
       <w:pPr>
+        <w:pStyle w:val="Prrafodelista"/>
         <w:keepLines/>
-        <w:ind w:left="397" w:hanging="397"/>
-      </w:pPr>
-      <w:r>
-        <w:t xml:space="preserve">scikit-learn developers. (s. f.). </w:t>
-      </w:r>
+        <w:numPr>
+          <w:ilvl w:val="0"/>
+          <w:numId w:val="7"/>
+        </w:numPr>
+        <w:jc w:val="left"/>
+      </w:pPr>
+      <w:proofErr w:type="spellStart"/>
+      <w:r>
+        <w:t>scikit-learn</w:t>
+      </w:r>
+      <w:proofErr w:type="spellEnd"/>
+      <w:r>
+        <w:t xml:space="preserve"> </w:t>
+      </w:r>
+      <w:proofErr w:type="spellStart"/>
+      <w:r>
+        <w:t>developers</w:t>
+      </w:r>
+      <w:proofErr w:type="spellEnd"/>
+      <w:r>
+        <w:t xml:space="preserve">. (s. f.). </w:t>
+      </w:r>
+      <w:proofErr w:type="spellStart"/>
       <w:r>
         <w:rPr>
           <w:i/>
         </w:rPr>
         <w:t>OneHotEncoder</w:t>
       </w:r>
-      <w:r>
-        <w:t>. https://scikit-learn.org/stable/modules/generated/sklearn.preprocessing.OneHotEncoder.html</w:t>
-      </w:r>
-    </w:p>
-    <w:p>
-      <w:pPr>
+      <w:proofErr w:type="spellEnd"/>
+      <w:r>
+        <w:t xml:space="preserve">. </w:t>
+      </w:r>
+      <w:hyperlink r:id="rId24" w:history="1">
+        <w:r>
+          <w:rPr>
+            <w:rStyle w:val="Hipervnculo"/>
+          </w:rPr>
+          <w:t>https://scikit-learn.org/stable/modules/generated/sklearn.preprocessing.OneHotEncoder.html</w:t>
+        </w:r>
+      </w:hyperlink>
+    </w:p>
+    <w:p>
+      <w:pPr>
+        <w:pStyle w:val="Prrafodelista"/>
         <w:keepLines/>
-        <w:ind w:left="397" w:hanging="397"/>
-      </w:pPr>
-      <w:r>
-        <w:t xml:space="preserve">The pandas development team. (s. f.). </w:t>
-      </w:r>
+        <w:numPr>
+          <w:ilvl w:val="0"/>
+          <w:numId w:val="7"/>
+        </w:numPr>
+        <w:jc w:val="left"/>
+      </w:pPr>
+      <w:r>
+        <w:t xml:space="preserve">The pandas </w:t>
+      </w:r>
+      <w:proofErr w:type="spellStart"/>
+      <w:r>
+        <w:t>development</w:t>
+      </w:r>
+      <w:proofErr w:type="spellEnd"/>
+      <w:r>
+        <w:t xml:space="preserve"> </w:t>
+      </w:r>
+      <w:proofErr w:type="spellStart"/>
+      <w:r>
+        <w:t>team</w:t>
+      </w:r>
+      <w:proofErr w:type="spellEnd"/>
+      <w:r>
+        <w:t xml:space="preserve">. (s. f.). </w:t>
+      </w:r>
+      <w:proofErr w:type="spellStart"/>
+      <w:proofErr w:type="gramStart"/>
       <w:r>
         <w:rPr>
           <w:i/>
         </w:rPr>
-        <w:t>pandas.read_csv</w:t>
-      </w:r>
-      <w:r>
-        <w:t>. https://pandas.pydata.org/docs/reference/api/pandas.read_csv.html</w:t>
-      </w:r>
-    </w:p>
-    <w:p>
-      <w:pPr>
+        <w:t>pandas.read</w:t>
+      </w:r>
+      <w:proofErr w:type="gramEnd"/>
+      <w:r>
+        <w:rPr>
+          <w:i/>
+        </w:rPr>
+        <w:t>_csv</w:t>
+      </w:r>
+      <w:proofErr w:type="spellEnd"/>
+      <w:r>
+        <w:t xml:space="preserve">. </w:t>
+      </w:r>
+      <w:hyperlink r:id="rId25" w:history="1">
+        <w:r>
+          <w:rPr>
+            <w:rStyle w:val="Hipervnculo"/>
+          </w:rPr>
+          <w:t>https://pandas.pydata.org/docs/reference/api/pandas.read_csv.html</w:t>
+        </w:r>
+      </w:hyperlink>
+    </w:p>
+    <w:p>
+      <w:pPr>
+        <w:pStyle w:val="Prrafodelista"/>
         <w:keepLines/>
-        <w:ind w:left="397" w:hanging="397"/>
+        <w:numPr>
+          <w:ilvl w:val="0"/>
+          <w:numId w:val="7"/>
+        </w:numPr>
+        <w:jc w:val="left"/>
       </w:pPr>
       <w:r>
         <w:t xml:space="preserve">Universidad Andrés Bello. (2026). </w:t>
@@ -3140,8 +3483,8 @@
       </w:r>
     </w:p>
     <w:sectPr>
-      <w:headerReference w:type="default" r:id="rId22"/>
-      <w:footerReference w:type="default" r:id="rId23"/>
+      <w:headerReference w:type="default" r:id="rId26"/>
+      <w:footerReference w:type="default" r:id="rId27"/>
       <w:pgSz w:w="12240" w:h="15840"/>
       <w:pgMar w:top="1100" w:right="840" w:bottom="1340" w:left="1020" w:header="493" w:footer="1149" w:gutter="0"/>
       <w:cols w:space="720"/>
@@ -3173,7 +3516,7 @@
 <w:ftr xmlns:wpc="http://schemas.microsoft.com/office/word/2010/wordprocessingCanvas" xmlns:cx="http://schemas.microsoft.com/office/drawing/2014/chartex" xmlns:cx1="http://schemas.microsoft.com/office/drawing/2015/9/8/chartex" xmlns:cx2="http://schemas.microsoft.com/office/drawing/2015/10/21/chartex" xmlns:cx3="http://schemas.microsoft.com/office/drawing/2016/5/9/chartex" xmlns:cx4="http://schemas.microsoft.com/office/drawing/2016/5/10/chartex" xmlns:cx5="http://schemas.microsoft.com/office/drawing/2016/5/11/chartex" xmlns:cx6="http://schemas.microsoft.com/office/drawing/2016/5/12/chartex" xmlns:cx7="http://schemas.microsoft.com/office/drawing/2016/5/13/chartex" xmlns:cx8="http://schemas.microsoft.com/office/drawing/2016/5/14/chartex" xmlns:mc="http://schemas.openxmlformats.org/markup-compatibility/2006" xmlns:aink="http://schemas.microsoft.com/office/drawing/2016/ink" xmlns:am3d="http://schemas.microsoft.com/office/drawing/2017/model3d" xmlns:o="urn:schemas-microsoft-com:office:office" xmlns:oel="http://schemas.microsoft.com/office/2019/extlst" xmlns:r="http://schemas.openxmlformats.org/officeDocument/2006/relationships" xmlns:m="http://schemas.openxmlformats.org/officeDocument/2006/math" xmlns:v="urn:schemas-microsoft-com:vml" xmlns:wp14="http://schemas.microsoft.com/office/word/2010/wordprocessingDrawing" xmlns:wp="http://schemas.openxmlformats.org/drawingml/2006/wordprocessingDrawing" xmlns:w10="urn:schemas-microsoft-com:office:word" xmlns:w="http://schemas.openxmlformats.org/wordprocessingml/2006/main" xmlns:w14="http://schemas.microsoft.com/office/word/2010/wordml" xmlns:w15="http://schemas.microsoft.com/office/word/2012/wordml" xmlns:w16cex="http://schemas.microsoft.com/office/word/2018/wordml/cex" xmlns:w16cid="http://schemas.microsoft.com/office/word/2016/wordml/cid" xmlns:w16="http://schemas.microsoft.com/office/word/2018/wordml" xmlns:w16du="http://schemas.microsoft.com/office/word/2023/wordml/word16du" xmlns:w16sdtdh="http://schemas.microsoft.com/office/word/2020/wordml/sdtdatahash" xmlns:w16sdtfl="http://schemas.microsoft.com/office/word/2024/wordml/sdtformatlock" xmlns:w16se="http://schemas.microsoft.com/office/word/2015/wordml/symex" xmlns:wpg="http://schemas.microsoft.com/office/word/2010/wordprocessingGroup" xmlns:wpi="http://schemas.microsoft.com/office/word/2010/wordprocessingInk" xmlns:wne="http://schemas.microsoft.com/office/word/2006/wordml" xmlns:wps="http://schemas.microsoft.com/office/word/2010/wordprocessingShape" mc:Ignorable="w14 w15 w16se w16cid w16 w16cex w16sdtdh w16sdtfl w16du wp14">
   <w:p>
     <w:pPr>
-      <w:pStyle w:val="BodyText"/>
+      <w:pStyle w:val="Textoindependiente"/>
       <w:spacing w:line="14" w:lineRule="auto"/>
       <w:rPr>
         <w:sz w:val="20"/>
@@ -3296,7 +3639,7 @@
             </wp:anchor>
           </w:drawing>
         </mc:Choice>
-        <mc:Fallback xmlns:a="http://schemas.openxmlformats.org/drawingml/2006/main" xmlns:pic="http://schemas.openxmlformats.org/drawingml/2006/picture">
+        <mc:Fallback xmlns:pic="http://schemas.openxmlformats.org/drawingml/2006/picture" xmlns:a="http://schemas.openxmlformats.org/drawingml/2006/main">
           <w:pict>
             <v:shape id="Graphic 17" style="position:absolute;margin-left:42.5pt;margin-top:739.9pt;width:218.15pt;height:.1pt;z-index:-15813632;visibility:visible;mso-wrap-style:square;mso-wrap-distance-left:0;mso-wrap-distance-top:0;mso-wrap-distance-right:0;mso-wrap-distance-bottom:0;mso-position-horizontal:absolute;mso-position-horizontal-relative:page;mso-position-vertical:absolute;mso-position-vertical-relative:page;v-text-anchor:top" coordsize="2770505,1270" o:spid="_x0000_s1026" filled="f" strokecolor="#1d4b63" path="m,l2770204,e" o:gfxdata="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" w14:anchorId="13F26F17">
               <v:path arrowok="t"/>
@@ -3375,7 +3718,7 @@
             </wp:anchor>
           </w:drawing>
         </mc:Choice>
-        <mc:Fallback xmlns:a="http://schemas.openxmlformats.org/drawingml/2006/main" xmlns:pic="http://schemas.openxmlformats.org/drawingml/2006/picture">
+        <mc:Fallback xmlns:pic="http://schemas.openxmlformats.org/drawingml/2006/picture" xmlns:a="http://schemas.openxmlformats.org/drawingml/2006/main">
           <w:pict>
             <v:shape id="Graphic 18" style="position:absolute;margin-left:371.35pt;margin-top:739.9pt;width:198.15pt;height:.1pt;z-index:-15813120;visibility:visible;mso-wrap-style:square;mso-wrap-distance-left:0;mso-wrap-distance-top:0;mso-wrap-distance-right:0;mso-wrap-distance-bottom:0;mso-position-horizontal:absolute;mso-position-horizontal-relative:page;mso-position-vertical:absolute;mso-position-vertical-relative:page;v-text-anchor:top" coordsize="2516505,1270" o:spid="_x0000_s1026" filled="f" strokecolor="#1d4b63" path="m,l2516399,e" o:gfxdata="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" w14:anchorId="0A3DBCE8">
               <v:path arrowok="t"/>
@@ -3412,7 +3755,7 @@
 <w:hdr xmlns:wpc="http://schemas.microsoft.com/office/word/2010/wordprocessingCanvas" xmlns:cx="http://schemas.microsoft.com/office/drawing/2014/chartex" xmlns:cx1="http://schemas.microsoft.com/office/drawing/2015/9/8/chartex" xmlns:cx2="http://schemas.microsoft.com/office/drawing/2015/10/21/chartex" xmlns:cx3="http://schemas.microsoft.com/office/drawing/2016/5/9/chartex" xmlns:cx4="http://schemas.microsoft.com/office/drawing/2016/5/10/chartex" xmlns:cx5="http://schemas.microsoft.com/office/drawing/2016/5/11/chartex" xmlns:cx6="http://schemas.microsoft.com/office/drawing/2016/5/12/chartex" xmlns:cx7="http://schemas.microsoft.com/office/drawing/2016/5/13/chartex" xmlns:cx8="http://schemas.microsoft.com/office/drawing/2016/5/14/chartex" xmlns:mc="http://schemas.openxmlformats.org/markup-compatibility/2006" xmlns:aink="http://schemas.microsoft.com/office/drawing/2016/ink" xmlns:am3d="http://schemas.microsoft.com/office/drawing/2017/model3d" xmlns:o="urn:schemas-microsoft-com:office:office" xmlns:oel="http://schemas.microsoft.com/office/2019/extlst" xmlns:r="http://schemas.openxmlformats.org/officeDocument/2006/relationships" xmlns:m="http://schemas.openxmlformats.org/officeDocument/2006/math" xmlns:v="urn:schemas-microsoft-com:vml" xmlns:wp14="http://schemas.microsoft.com/office/word/2010/wordprocessingDrawing" xmlns:wp="http://schemas.openxmlformats.org/drawingml/2006/wordprocessingDrawing" xmlns:w10="urn:schemas-microsoft-com:office:word" xmlns:w="http://schemas.openxmlformats.org/wordprocessingml/2006/main" xmlns:w14="http://schemas.microsoft.com/office/word/2010/wordml" xmlns:w15="http://schemas.microsoft.com/office/word/2012/wordml" xmlns:w16cex="http://schemas.microsoft.com/office/word/2018/wordml/cex" xmlns:w16cid="http://schemas.microsoft.com/office/word/2016/wordml/cid" xmlns:w16="http://schemas.microsoft.com/office/word/2018/wordml" xmlns:w16du="http://schemas.microsoft.com/office/word/2023/wordml/word16du" xmlns:w16sdtdh="http://schemas.microsoft.com/office/word/2020/wordml/sdtdatahash" xmlns:w16sdtfl="http://schemas.microsoft.com/office/word/2024/wordml/sdtformatlock" xmlns:w16se="http://schemas.microsoft.com/office/word/2015/wordml/symex" xmlns:wpg="http://schemas.microsoft.com/office/word/2010/wordprocessingGroup" xmlns:wpi="http://schemas.microsoft.com/office/word/2010/wordprocessingInk" xmlns:wne="http://schemas.microsoft.com/office/word/2006/wordml" xmlns:wps="http://schemas.microsoft.com/office/word/2010/wordprocessingShape" mc:Ignorable="w14 w15 w16se w16cid w16 w16cex w16sdtdh w16sdtfl w16du wp14">
   <w:p>
     <w:pPr>
-      <w:pStyle w:val="BodyText"/>
+      <w:pStyle w:val="Textoindependiente"/>
       <w:spacing w:line="14" w:lineRule="auto"/>
       <w:rPr>
         <w:sz w:val="20"/>
@@ -3520,7 +3863,7 @@
             </wp:anchor>
           </w:drawing>
         </mc:Choice>
-        <mc:Fallback xmlns:a="http://schemas.openxmlformats.org/drawingml/2006/main" xmlns:pic="http://schemas.openxmlformats.org/drawingml/2006/picture">
+        <mc:Fallback xmlns:pic="http://schemas.openxmlformats.org/drawingml/2006/picture" xmlns:a="http://schemas.openxmlformats.org/drawingml/2006/main">
           <w:pict>
             <v:group id="Group 12" style="position:absolute;margin-left:42.5pt;margin-top:37.85pt;width:527pt;height:9.1pt;z-index:-15815168;mso-wrap-distance-left:0;mso-wrap-distance-right:0;mso-position-horizontal-relative:page;mso-position-vertical-relative:page" coordsize="66929,1155" o:spid="_x0000_s1026" w14:anchorId="172A29D3" o:gfxdata="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">
               <v:shape id="Graphic 13" style="position:absolute;left:539;top:551;width:66390;height:13;visibility:visible;mso-wrap-style:square;v-text-anchor:top" coordsize="6638925,1270" o:spid="_x0000_s1027" filled="f" strokecolor="#1d4b63" path="m,l6638404,e" o:gfxdata="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">
@@ -3660,7 +4003,7 @@
               <v:stroke joinstyle="miter"/>
               <v:path gradientshapeok="t" o:connecttype="rect"/>
             </v:shapetype>
-            <v:shape id="Textbox 15" o:spid="_x0000_s1026" type="#_x0000_t202" style="position:absolute;margin-left:560.4pt;margin-top:23.65pt;width:13.1pt;height:14pt;z-index:-15814656;visibility:visible;mso-wrap-style:square;mso-wrap-distance-left:0;mso-wrap-distance-top:0;mso-wrap-distance-right:0;mso-wrap-distance-bottom:0;mso-position-horizontal:absolute;mso-position-horizontal-relative:page;mso-position-vertical:absolute;mso-position-vertical-relative:page;v-text-anchor:top" o:gfxdata="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" filled="f" stroked="f">
+            <v:shape id="Textbox 15" o:spid="_x0000_s1026" type="#_x0000_t202" style="position:absolute;left:0;text-align:left;margin-left:560.4pt;margin-top:23.65pt;width:13.1pt;height:14pt;z-index:-15814656;visibility:visible;mso-wrap-style:square;mso-wrap-distance-left:0;mso-wrap-distance-top:0;mso-wrap-distance-right:0;mso-wrap-distance-bottom:0;mso-position-horizontal:absolute;mso-position-horizontal-relative:page;mso-position-vertical:absolute;mso-position-vertical-relative:page;v-text-anchor:top" o:gfxdata="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" filled="f" stroked="f">
               <v:textbox inset="0,0,0,0">
                 <w:txbxContent>
                   <w:p>
@@ -4357,6 +4700,118 @@
       </w:pPr>
     </w:lvl>
   </w:abstractNum>
+  <w:abstractNum w:abstractNumId="6" w15:restartNumberingAfterBreak="0">
+    <w:nsid w:val="4E4866F4"/>
+    <w:multiLevelType w:val="hybridMultilevel"/>
+    <w:tmpl w:val="48347A38"/>
+    <w:lvl w:ilvl="0" w:tplc="D0EEBD86">
+      <w:numFmt w:val="bullet"/>
+      <w:lvlText w:val="-"/>
+      <w:lvlJc w:val="left"/>
+      <w:pPr>
+        <w:ind w:left="720" w:hanging="360"/>
+      </w:pPr>
+      <w:rPr>
+        <w:rFonts w:ascii="Arial" w:eastAsia="Arial" w:hAnsi="Arial" w:cs="Arial" w:hint="default"/>
+      </w:rPr>
+    </w:lvl>
+    <w:lvl w:ilvl="1" w:tplc="340A0003" w:tentative="1">
+      <w:start w:val="1"/>
+      <w:numFmt w:val="bullet"/>
+      <w:lvlText w:val="o"/>
+      <w:lvlJc w:val="left"/>
+      <w:pPr>
+        <w:ind w:left="1440" w:hanging="360"/>
+      </w:pPr>
+      <w:rPr>
+        <w:rFonts w:ascii="Courier New" w:hAnsi="Courier New" w:cs="Courier New" w:hint="default"/>
+      </w:rPr>
+    </w:lvl>
+    <w:lvl w:ilvl="2" w:tplc="340A0005" w:tentative="1">
+      <w:start w:val="1"/>
+      <w:numFmt w:val="bullet"/>
+      <w:lvlText w:val=""/>
+      <w:lvlJc w:val="left"/>
+      <w:pPr>
+        <w:ind w:left="2160" w:hanging="360"/>
+      </w:pPr>
+      <w:rPr>
+        <w:rFonts w:ascii="Wingdings" w:hAnsi="Wingdings" w:hint="default"/>
+      </w:rPr>
+    </w:lvl>
+    <w:lvl w:ilvl="3" w:tplc="340A0001" w:tentative="1">
+      <w:start w:val="1"/>
+      <w:numFmt w:val="bullet"/>
+      <w:lvlText w:val=""/>
+      <w:lvlJc w:val="left"/>
+      <w:pPr>
+        <w:ind w:left="2880" w:hanging="360"/>
+      </w:pPr>
+      <w:rPr>
+        <w:rFonts w:ascii="Symbol" w:hAnsi="Symbol" w:hint="default"/>
+      </w:rPr>
+    </w:lvl>
+    <w:lvl w:ilvl="4" w:tplc="340A0003" w:tentative="1">
+      <w:start w:val="1"/>
+      <w:numFmt w:val="bullet"/>
+      <w:lvlText w:val="o"/>
+      <w:lvlJc w:val="left"/>
+      <w:pPr>
+        <w:ind w:left="3600" w:hanging="360"/>
+      </w:pPr>
+      <w:rPr>
+        <w:rFonts w:ascii="Courier New" w:hAnsi="Courier New" w:cs="Courier New" w:hint="default"/>
+      </w:rPr>
+    </w:lvl>
+    <w:lvl w:ilvl="5" w:tplc="340A0005" w:tentative="1">
+      <w:start w:val="1"/>
+      <w:numFmt w:val="bullet"/>
+      <w:lvlText w:val=""/>
+      <w:lvlJc w:val="left"/>
+      <w:pPr>
+        <w:ind w:left="4320" w:hanging="360"/>
+      </w:pPr>
+      <w:rPr>
+        <w:rFonts w:ascii="Wingdings" w:hAnsi="Wingdings" w:hint="default"/>
+      </w:rPr>
+    </w:lvl>
+    <w:lvl w:ilvl="6" w:tplc="340A0001" w:tentative="1">
+      <w:start w:val="1"/>
+      <w:numFmt w:val="bullet"/>
+      <w:lvlText w:val=""/>
+      <w:lvlJc w:val="left"/>
+      <w:pPr>
+        <w:ind w:left="5040" w:hanging="360"/>
+      </w:pPr>
+      <w:rPr>
+        <w:rFonts w:ascii="Symbol" w:hAnsi="Symbol" w:hint="default"/>
+      </w:rPr>
+    </w:lvl>
+    <w:lvl w:ilvl="7" w:tplc="340A0003" w:tentative="1">
+      <w:start w:val="1"/>
+      <w:numFmt w:val="bullet"/>
+      <w:lvlText w:val="o"/>
+      <w:lvlJc w:val="left"/>
+      <w:pPr>
+        <w:ind w:left="5760" w:hanging="360"/>
+      </w:pPr>
+      <w:rPr>
+        <w:rFonts w:ascii="Courier New" w:hAnsi="Courier New" w:cs="Courier New" w:hint="default"/>
+      </w:rPr>
+    </w:lvl>
+    <w:lvl w:ilvl="8" w:tplc="340A0005" w:tentative="1">
+      <w:start w:val="1"/>
+      <w:numFmt w:val="bullet"/>
+      <w:lvlText w:val=""/>
+      <w:lvlJc w:val="left"/>
+      <w:pPr>
+        <w:ind w:left="6480" w:hanging="360"/>
+      </w:pPr>
+      <w:rPr>
+        <w:rFonts w:ascii="Wingdings" w:hAnsi="Wingdings" w:hint="default"/>
+      </w:rPr>
+    </w:lvl>
+  </w:abstractNum>
   <w:num w:numId="1" w16cid:durableId="1792236605">
     <w:abstractNumId w:val="2"/>
   </w:num>
@@ -4401,6 +4856,9 @@
   </w:num>
   <w:num w:numId="6" w16cid:durableId="453016458">
     <w:abstractNumId w:val="1"/>
+  </w:num>
+  <w:num w:numId="7" w16cid:durableId="1781220939">
+    <w:abstractNumId w:val="6"/>
   </w:num>
 </w:numbering>
 </file>
@@ -4805,22 +5263,24 @@
   <w:style w:type="paragraph" w:default="1" w:styleId="Normal">
     <w:name w:val="Normal"/>
     <w:qFormat/>
+    <w:rsid w:val="00937481"/>
     <w:pPr>
       <w:spacing w:after="140" w:line="276" w:lineRule="auto"/>
+      <w:jc w:val="both"/>
     </w:pPr>
     <w:rPr>
       <w:rFonts w:ascii="Arial" w:eastAsia="Arial" w:hAnsi="Arial" w:cs="Arial"/>
       <w:color w:val="000000"/>
-      <w:lang w:val="es-ES"/>
+      <w:lang w:val="es-CL"/>
     </w:rPr>
   </w:style>
-  <w:style w:type="character" w:default="1" w:styleId="DefaultParagraphFont">
+  <w:style w:type="character" w:default="1" w:styleId="Fuentedeprrafopredeter">
     <w:name w:val="Default Paragraph Font"/>
     <w:uiPriority w:val="1"/>
     <w:semiHidden/>
     <w:unhideWhenUsed/>
   </w:style>
-  <w:style w:type="table" w:default="1" w:styleId="TableNormal">
+  <w:style w:type="table" w:default="1" w:styleId="Tablanormal">
     <w:name w:val="Normal Table"/>
     <w:uiPriority w:val="99"/>
     <w:semiHidden/>
@@ -4835,7 +5295,7 @@
       </w:tblCellMar>
     </w:tblPr>
   </w:style>
-  <w:style w:type="numbering" w:default="1" w:styleId="NoList">
+  <w:style w:type="numbering" w:default="1" w:styleId="Sinlista">
     <w:name w:val="No List"/>
     <w:uiPriority w:val="99"/>
     <w:semiHidden/>
@@ -4857,13 +5317,13 @@
       </w:tblCellMar>
     </w:tblPr>
   </w:style>
-  <w:style w:type="paragraph" w:styleId="BodyText">
+  <w:style w:type="paragraph" w:styleId="Textoindependiente">
     <w:name w:val="Body Text"/>
     <w:basedOn w:val="Normal"/>
     <w:uiPriority w:val="1"/>
     <w:qFormat/>
   </w:style>
-  <w:style w:type="paragraph" w:styleId="Title">
+  <w:style w:type="paragraph" w:styleId="Ttulo">
     <w:name w:val="Title"/>
     <w:basedOn w:val="Normal"/>
     <w:uiPriority w:val="10"/>
@@ -4879,16 +5339,15 @@
       <w:szCs w:val="56"/>
     </w:rPr>
   </w:style>
-  <w:style w:type="paragraph" w:styleId="ListParagraph">
+  <w:style w:type="paragraph" w:styleId="Prrafodelista">
     <w:name w:val="List Paragraph"/>
     <w:basedOn w:val="Normal"/>
-    <w:link w:val="ListParagraphChar"/>
+    <w:link w:val="PrrafodelistaCar"/>
     <w:uiPriority w:val="34"/>
     <w:qFormat/>
     <w:pPr>
       <w:spacing w:before="168"/>
       <w:ind w:left="1207" w:right="345" w:hanging="340"/>
-      <w:jc w:val="both"/>
     </w:pPr>
   </w:style>
   <w:style w:type="paragraph" w:customStyle="1" w:styleId="TableParagraph">
@@ -4899,17 +5358,17 @@
   </w:style>
   <w:style w:type="character" w:customStyle="1" w:styleId="normaltextrun">
     <w:name w:val="normaltextrun"/>
-    <w:basedOn w:val="DefaultParagraphFont"/>
+    <w:basedOn w:val="Fuentedeprrafopredeter"/>
     <w:rsid w:val="00E02CCA"/>
   </w:style>
   <w:style w:type="character" w:customStyle="1" w:styleId="eop">
     <w:name w:val="eop"/>
-    <w:basedOn w:val="DefaultParagraphFont"/>
+    <w:basedOn w:val="Fuentedeprrafopredeter"/>
     <w:rsid w:val="00464217"/>
   </w:style>
-  <w:style w:type="character" w:customStyle="1" w:styleId="ListParagraphChar">
-    <w:name w:val="List Paragraph Char"/>
-    <w:link w:val="ListParagraph"/>
+  <w:style w:type="character" w:customStyle="1" w:styleId="PrrafodelistaCar">
+    <w:name w:val="Párrafo de lista Car"/>
+    <w:link w:val="Prrafodelista"/>
     <w:uiPriority w:val="34"/>
     <w:qFormat/>
     <w:rsid w:val="005F5AD8"/>
@@ -4946,7 +5405,7 @@
       <w:sz w:val="23"/>
     </w:rPr>
   </w:style>
-  <w:style w:type="paragraph" w:styleId="TOC1">
+  <w:style w:type="paragraph" w:styleId="TDC1">
     <w:name w:val="toc 1"/>
     <w:basedOn w:val="Normal"/>
     <w:next w:val="Normal"/>
@@ -4958,15 +5417,27 @@
       <w:spacing w:after="100"/>
     </w:pPr>
   </w:style>
-  <w:style w:type="character" w:styleId="Hyperlink">
+  <w:style w:type="character" w:styleId="Hipervnculo">
     <w:name w:val="Hyperlink"/>
-    <w:basedOn w:val="DefaultParagraphFont"/>
+    <w:basedOn w:val="Fuentedeprrafopredeter"/>
     <w:uiPriority w:val="99"/>
     <w:unhideWhenUsed/>
     <w:rsid w:val="00F47D37"/>
     <w:rPr>
       <w:color w:val="0000FF" w:themeColor="hyperlink"/>
       <w:u w:val="single"/>
+    </w:rPr>
+  </w:style>
+  <w:style w:type="character" w:styleId="Mencinsinresolver">
+    <w:name w:val="Unresolved Mention"/>
+    <w:basedOn w:val="Fuentedeprrafopredeter"/>
+    <w:uiPriority w:val="99"/>
+    <w:semiHidden/>
+    <w:unhideWhenUsed/>
+    <w:rsid w:val="00937481"/>
+    <w:rPr>
+      <w:color w:val="605E5C"/>
+      <w:shd w:val="clear" w:color="auto" w:fill="E1DFDD"/>
     </w:rPr>
   </w:style>
 </w:styles>
@@ -5256,32 +5727,12 @@
 </file>
 
 <file path=customXml/item1.xml><?xml version="1.0" encoding="utf-8"?>
-<p:properties xmlns:p="http://schemas.microsoft.com/office/2006/metadata/properties" xmlns:xsi="http://www.w3.org/2001/XMLSchema-instance" xmlns:pc="http://schemas.microsoft.com/office/infopath/2007/PartnerControls">
-  <documentManagement>
-    <_ApprovalAssignedTo xmlns="0a2fff00-f002-44e7-b50c-b90cb65110b9">
-      <UserInfo>
-        <DisplayName/>
-        <AccountId xsi:nil="true"/>
-        <AccountType/>
-      </UserInfo>
-    </_ApprovalAssignedTo>
-    <_ApprovalRespondedBy xmlns="0a2fff00-f002-44e7-b50c-b90cb65110b9">
-      <UserInfo>
-        <DisplayName/>
-        <AccountId xsi:nil="true"/>
-        <AccountType/>
-      </UserInfo>
-    </_ApprovalRespondedBy>
-    <_ApprovalStatus xmlns="0a2fff00-f002-44e7-b50c-b90cb65110b9">0</_ApprovalStatus>
-    <_ApprovalSentBy xmlns="0a2fff00-f002-44e7-b50c-b90cb65110b9">
-      <UserInfo>
-        <DisplayName/>
-        <AccountId xsi:nil="true"/>
-        <AccountType/>
-      </UserInfo>
-    </_ApprovalSentBy>
-  </documentManagement>
-</p:properties>
+<?mso-contentType ?>
+<FormTemplates xmlns="http://schemas.microsoft.com/sharepoint/v3/contenttype/forms">
+  <Display>DocumentLibraryForm</Display>
+  <Edit>DocumentLibraryForm</Edit>
+  <New>DocumentLibraryForm</New>
+</FormTemplates>
 </file>
 
 <file path=customXml/item2.xml><?xml version="1.0" encoding="utf-8"?>
@@ -5513,12 +5964,32 @@
 </file>
 
 <file path=customXml/item3.xml><?xml version="1.0" encoding="utf-8"?>
-<?mso-contentType ?>
-<FormTemplates xmlns="http://schemas.microsoft.com/sharepoint/v3/contenttype/forms">
-  <Display>DocumentLibraryForm</Display>
-  <Edit>DocumentLibraryForm</Edit>
-  <New>DocumentLibraryForm</New>
-</FormTemplates>
+<p:properties xmlns:p="http://schemas.microsoft.com/office/2006/metadata/properties" xmlns:xsi="http://www.w3.org/2001/XMLSchema-instance" xmlns:pc="http://schemas.microsoft.com/office/infopath/2007/PartnerControls">
+  <documentManagement>
+    <_ApprovalAssignedTo xmlns="0a2fff00-f002-44e7-b50c-b90cb65110b9">
+      <UserInfo>
+        <DisplayName/>
+        <AccountId xsi:nil="true"/>
+        <AccountType/>
+      </UserInfo>
+    </_ApprovalAssignedTo>
+    <_ApprovalRespondedBy xmlns="0a2fff00-f002-44e7-b50c-b90cb65110b9">
+      <UserInfo>
+        <DisplayName/>
+        <AccountId xsi:nil="true"/>
+        <AccountType/>
+      </UserInfo>
+    </_ApprovalRespondedBy>
+    <_ApprovalStatus xmlns="0a2fff00-f002-44e7-b50c-b90cb65110b9">0</_ApprovalStatus>
+    <_ApprovalSentBy xmlns="0a2fff00-f002-44e7-b50c-b90cb65110b9">
+      <UserInfo>
+        <DisplayName/>
+        <AccountId xsi:nil="true"/>
+        <AccountType/>
+      </UserInfo>
+    </_ApprovalSentBy>
+  </documentManagement>
+</p:properties>
 </file>
 
 <file path=customXml/item4.xml><?xml version="1.0" encoding="utf-8"?>
@@ -5526,11 +5997,9 @@
 </file>
 
 <file path=customXml/itemProps1.xml><?xml version="1.0" encoding="utf-8"?>
-<ds:datastoreItem xmlns:ds="http://schemas.openxmlformats.org/officeDocument/2006/customXml" ds:itemID="{662F60C8-4BC5-4139-BE63-6954D22D77BD}">
+<ds:datastoreItem xmlns:ds="http://schemas.openxmlformats.org/officeDocument/2006/customXml" ds:itemID="{084C26D9-49C9-4ADB-A387-DA6079798921}">
   <ds:schemaRefs>
-    <ds:schemaRef ds:uri="http://schemas.microsoft.com/office/2006/metadata/properties"/>
-    <ds:schemaRef ds:uri="http://schemas.microsoft.com/office/infopath/2007/PartnerControls"/>
-    <ds:schemaRef ds:uri="0a2fff00-f002-44e7-b50c-b90cb65110b9"/>
+    <ds:schemaRef ds:uri="http://schemas.microsoft.com/sharepoint/v3/contenttype/forms"/>
   </ds:schemaRefs>
 </ds:datastoreItem>
 </file>
@@ -5554,9 +6023,11 @@
 </file>
 
 <file path=customXml/itemProps3.xml><?xml version="1.0" encoding="utf-8"?>
-<ds:datastoreItem xmlns:ds="http://schemas.openxmlformats.org/officeDocument/2006/customXml" ds:itemID="{084C26D9-49C9-4ADB-A387-DA6079798921}">
+<ds:datastoreItem xmlns:ds="http://schemas.openxmlformats.org/officeDocument/2006/customXml" ds:itemID="{662F60C8-4BC5-4139-BE63-6954D22D77BD}">
   <ds:schemaRefs>
-    <ds:schemaRef ds:uri="http://schemas.microsoft.com/sharepoint/v3/contenttype/forms"/>
+    <ds:schemaRef ds:uri="http://schemas.microsoft.com/office/2006/metadata/properties"/>
+    <ds:schemaRef ds:uri="http://schemas.microsoft.com/office/infopath/2007/PartnerControls"/>
+    <ds:schemaRef ds:uri="0a2fff00-f002-44e7-b50c-b90cb65110b9"/>
   </ds:schemaRefs>
 </ds:datastoreItem>
 </file>

</xml_diff>

<commit_message>
F3: limpia archivos residuales y aclara entregables
</commit_message>
<xml_diff>
--- a/F3/f3_s02_grupo2.docx
+++ b/F3/f3_s02_grupo2.docx
@@ -1108,6 +1108,18 @@
           <w:cols w:space="720"/>
         </w:sectPr>
       </w:pPr>
+      <w:r>
+        <w:t xml:space="preserve">Repositorio del proyecto: </w:t>
+      </w:r>
+      <w:hyperlink r:id="rId30">
+        <w:r>
+          <w:rPr>
+            <w:color w:val="0563C1"/>
+            <w:u w:val="single"/>
+          </w:rPr>
+          <w:t>https://github.com/jorgealtamiranonavarrete-art/proyecto-grupo2</w:t>
+        </w:r>
+      </w:hyperlink>
     </w:p>
     <w:p>
       <w:pPr>
@@ -2980,47 +2992,7 @@
     <w:p/>
     <w:p>
       <w:r>
-        <w:t xml:space="preserve">La arquitectura conserva F2 como referencia y añade F3 sin copiar sus CSV. El avance está publicado en una rama del repositorio del grupo para revisión mediante un </w:t>
-      </w:r>
-      <w:proofErr w:type="spellStart"/>
-      <w:r>
-        <w:rPr>
-          <w:i/>
-          <w:iCs/>
-        </w:rPr>
-        <w:t>pull</w:t>
-      </w:r>
-      <w:proofErr w:type="spellEnd"/>
-      <w:r>
-        <w:rPr>
-          <w:i/>
-          <w:iCs/>
-        </w:rPr>
-        <w:t xml:space="preserve"> </w:t>
-      </w:r>
-      <w:proofErr w:type="spellStart"/>
-      <w:r>
-        <w:rPr>
-          <w:i/>
-          <w:iCs/>
-        </w:rPr>
-        <w:t>request</w:t>
-      </w:r>
-      <w:proofErr w:type="spellEnd"/>
-      <w:r>
-        <w:t xml:space="preserve">. Su integración a </w:t>
-      </w:r>
-      <w:proofErr w:type="spellStart"/>
-      <w:r>
-        <w:rPr>
-          <w:i/>
-          <w:iCs/>
-        </w:rPr>
-        <w:t>main</w:t>
-      </w:r>
-      <w:proofErr w:type="spellEnd"/>
-      <w:r>
-        <w:t xml:space="preserve"> queda sujeta a la revisión del equipo.</w:t>
+        <w:t>La arquitectura conserva F2 como referencia y añade F3 sin copiar sus CSV. El avance se encuentra integrado en la rama main del repositorio del grupo y sus cambios se registran en el historial de Git.</w:t>
       </w:r>
     </w:p>
     <w:p>

</xml_diff>